<commit_message>
update commit last changes
</commit_message>
<xml_diff>
--- a/00_Entregable_General_Documento_Final/Grupo4-Final_Documento_Oficial_PI.docx
+++ b/00_Entregable_General_Documento_Final/Grupo4-Final_Documento_Oficial_PI.docx
@@ -4,8 +4,9 @@
   <w:body>
     <w:p>
       <w:pPr>
-        <w:spacing w:after="0" w:line="259" w:lineRule="auto"/>
+        <w:spacing w:after="120" w:line="276" w:lineRule="auto" w:before="0"/>
         <w:ind w:left="-1133" w:right="10483" w:firstLine="0"/>
+        <w:jc w:val="both"/>
       </w:pPr>
       <w:r>
         <w:rPr>
@@ -6206,8 +6207,10 @@
     <w:p>
       <w:pPr>
         <w:pStyle w:val="Ttulo1"/>
+        <w:keepNext/>
+        <w:spacing w:before="240" w:after="80"/>
         <w:ind w:left="0" w:firstLine="0"/>
-        <w:jc w:val="center"/>
+        <w:jc w:val="left"/>
       </w:pPr>
       <w:r>
         <w:lastRenderedPageBreak/>
@@ -6216,7 +6219,9 @@
     </w:p>
     <w:p>
       <w:pPr>
+        <w:spacing w:line="276" w:lineRule="auto" w:after="120" w:before="0"/>
         <w:ind w:firstLine="708"/>
+        <w:jc w:val="both"/>
       </w:pPr>
       <w:r>
         <w:t xml:space="preserve">El propósito del actual Proyecto de Integración es automatizar el proceso de pesaje de vehículos en la empresa "El Troje", que recibe productos alimenticios y que presenta problemas en el momento de realizar el registro manual del peso de los camiones (errores al digitar el peso, pérdida de la trazabilidad y retrasos en la generación de los reportes administrativos). La solución a los problemas antes </w:t>
@@ -6282,7 +6287,9 @@
     </w:p>
     <w:p>
       <w:pPr>
+        <w:spacing w:line="276" w:lineRule="auto" w:after="120" w:before="0"/>
         <w:ind w:firstLine="708"/>
+        <w:jc w:val="both"/>
       </w:pPr>
       <w:r>
         <w:rPr>
@@ -6303,14 +6310,20 @@
     <w:p>
       <w:pPr>
         <w:pStyle w:val="Ttulo1"/>
+        <w:keepNext/>
+        <w:spacing w:before="240" w:after="80"/>
         <w:ind w:left="0" w:firstLine="0"/>
-        <w:jc w:val="center"/>
+        <w:jc w:val="left"/>
       </w:pPr>
       <w:r>
         <w:t xml:space="preserve">Introducción </w:t>
       </w:r>
     </w:p>
     <w:p>
+      <w:pPr>
+        <w:spacing w:line="276" w:lineRule="auto" w:after="120" w:before="0"/>
+        <w:jc w:val="both"/>
+      </w:pPr>
       <w:r>
         <w:t xml:space="preserve">El control de la producción agrícola en la actualidad es uno de los mayores problemas en cuanto a su gestión. En los puntos de acopio, el control de peso de los vehículos de carga se lleva a cabo de manera manual y, como consecuencia de ello, se producen errores en los cálculos, se pierde información y los tiempos necesarios para elaborar los correspondientes informes administrativos son mayores. A su vez, según Bass et al. (2022), la definición de la arquitectura es una de las partes más relevantes para poder determinar de forma precisa el funcionamiento y la estructura de la aplicación que se va a construir, con anterioridad a su despliegue. La empresa "El Troje", </w:t>
       </w:r>
@@ -6381,6 +6394,10 @@
       </w:r>
     </w:p>
     <w:p>
+      <w:pPr>
+        <w:spacing w:line="276" w:lineRule="auto" w:after="120" w:before="0"/>
+        <w:jc w:val="both"/>
+      </w:pPr>
       <w:r>
         <w:lastRenderedPageBreak/>
         <w:t xml:space="preserve">El equipo se comunicará con una báscula industrial de camiones Mettler Toledo IND780 por medio de comunicación ethernet, y el mismo podrá tomar el peso en tiempo real de cada vehículo, sin la intervención manual, protegiendo de esta forma la información desde el propio lugar de pesaje. La comunicación ethernet será mejor que la comunicación serial, ya que la comunicación serial no será la más conveniente para las aplicaciones web de la actualidad ni para las arquitecturas distribuidas. Adicionalmente, la comunicación ethernet generará registros de mayor calidad y tiempos de respuesta más cortos en el área de los despachos. Para la construcción del sistema se hará uso de angular en la interfaz web (angular, 2025; </w:t>
@@ -6426,9 +6443,16 @@
         <w:t>, 2024).</w:t>
       </w:r>
     </w:p>
-    <w:p/>
-    <w:p>
-      <w:pPr>
+    <w:p>
+      <w:pPr>
+        <w:spacing w:line="276" w:lineRule="auto" w:after="120" w:before="0"/>
+        <w:jc w:val="both"/>
+      </w:pPr>
+    </w:p>
+    <w:p>
+      <w:pPr>
+        <w:spacing w:line="276" w:lineRule="auto" w:after="120" w:before="0"/>
+        <w:jc w:val="both"/>
         <w:rPr>
           <w:b/>
         </w:rPr>
@@ -6441,6 +6465,10 @@
       </w:r>
     </w:p>
     <w:p>
+      <w:pPr>
+        <w:spacing w:line="276" w:lineRule="auto" w:after="120" w:before="0"/>
+        <w:jc w:val="both"/>
+      </w:pPr>
       <w:r>
         <w:t xml:space="preserve">En los diferentes centros de acopio del sector agrícola, el peso de los vehículos de carga y la toma de los </w:t>
       </w:r>
@@ -6473,7 +6501,9 @@
     </w:p>
     <w:p>
       <w:pPr>
+        <w:spacing w:line="276" w:lineRule="auto" w:after="120" w:before="0"/>
         <w:ind w:firstLine="0"/>
+        <w:jc w:val="both"/>
         <w:rPr>
           <w:b/>
         </w:rPr>
@@ -6486,6 +6516,10 @@
       </w:r>
     </w:p>
     <w:p>
+      <w:pPr>
+        <w:spacing w:line="276" w:lineRule="auto" w:after="120" w:before="0"/>
+        <w:jc w:val="both"/>
+      </w:pPr>
       <w:r>
         <w:t xml:space="preserve">El control del peso de los vehículos de carga, así como su control y registro, son controlados manualmente y con baja eficiencia, y a esto se le debe sumar el control manual y </w:t>
       </w:r>
@@ -6496,6 +6530,8 @@
     </w:p>
     <w:p>
       <w:pPr>
+        <w:spacing w:line="276" w:lineRule="auto" w:after="120" w:before="0"/>
+        <w:jc w:val="both"/>
         <w:rPr>
           <w:b/>
         </w:rPr>
@@ -6508,6 +6544,10 @@
       </w:r>
     </w:p>
     <w:p>
+      <w:pPr>
+        <w:spacing w:line="276" w:lineRule="auto" w:after="120" w:before="0"/>
+        <w:jc w:val="both"/>
+      </w:pPr>
       <w:r>
         <w:t>¿</w:t>
       </w:r>
@@ -6517,6 +6557,8 @@
     </w:p>
     <w:p>
       <w:pPr>
+        <w:spacing w:line="276" w:lineRule="auto" w:after="120" w:before="0"/>
+        <w:jc w:val="both"/>
         <w:rPr>
           <w:b/>
         </w:rPr>
@@ -6530,6 +6572,8 @@
     </w:p>
     <w:p>
       <w:pPr>
+        <w:spacing w:line="276" w:lineRule="auto" w:after="120" w:before="0"/>
+        <w:jc w:val="both"/>
         <w:rPr>
           <w:b/>
         </w:rPr>
@@ -6542,6 +6586,10 @@
       </w:r>
     </w:p>
     <w:p>
+      <w:pPr>
+        <w:spacing w:line="276" w:lineRule="auto" w:after="120" w:before="0"/>
+        <w:jc w:val="both"/>
+      </w:pPr>
       <w:r>
         <w:t>Construir un sistema informático en ambiente web que automatice el proceso de pesaje y control de los vehículos en la báscula de camiones de la empresa "El Troje", en la ciudad de Guayaquil; utilizando una báscula industrial de camiones de la marca Mettler Toledo con comunicación Ethernet. Dicho sistema, realizará la auditoría de todos los servicios, obtendrá la información necesaria para poder generar los reportes de traza de los procesos y, por ende, una mejor toma de decisiones y mayor confianza Operativa.</w:t>
       </w:r>
@@ -6549,7 +6597,9 @@
     <w:p>
       <w:pPr>
         <w:pStyle w:val="Prrafodelista"/>
+        <w:spacing w:line="276" w:lineRule="auto" w:after="120" w:before="0"/>
         <w:ind w:firstLine="0"/>
+        <w:jc w:val="both"/>
       </w:pPr>
       <w:r>
         <w:rPr>
@@ -6565,6 +6615,8 @@
           <w:ilvl w:val="0"/>
           <w:numId w:val="2"/>
         </w:numPr>
+        <w:spacing w:line="276" w:lineRule="auto" w:after="120" w:before="0"/>
+        <w:jc w:val="both"/>
       </w:pPr>
       <w:r>
         <w:t xml:space="preserve">Diseñar una interfaz web amigable para el registro de los vehículos, consulta de su peso y control. </w:t>
@@ -6577,6 +6629,8 @@
           <w:ilvl w:val="0"/>
           <w:numId w:val="2"/>
         </w:numPr>
+        <w:spacing w:line="276" w:lineRule="auto" w:after="120" w:before="0"/>
+        <w:jc w:val="both"/>
       </w:pPr>
       <w:r>
         <w:t xml:space="preserve">Realizar </w:t>
@@ -6592,6 +6646,8 @@
           <w:ilvl w:val="0"/>
           <w:numId w:val="2"/>
         </w:numPr>
+        <w:spacing w:line="276" w:lineRule="auto" w:after="120" w:before="0"/>
+        <w:jc w:val="both"/>
       </w:pPr>
       <w:r>
         <w:t xml:space="preserve">Establecer </w:t>
@@ -6628,6 +6684,8 @@
           <w:ilvl w:val="0"/>
           <w:numId w:val="2"/>
         </w:numPr>
+        <w:spacing w:line="276" w:lineRule="auto" w:after="120" w:before="0"/>
+        <w:jc w:val="both"/>
       </w:pPr>
       <w:r>
         <w:t>Emitir</w:t>
@@ -6655,7 +6713,9 @@
     </w:p>
     <w:p>
       <w:pPr>
+        <w:spacing w:line="276" w:lineRule="auto" w:after="120" w:before="0"/>
         <w:ind w:firstLine="0"/>
+        <w:jc w:val="both"/>
         <w:rPr>
           <w:b/>
         </w:rPr>
@@ -6663,8 +6723,8 @@
     </w:p>
     <w:p>
       <w:pPr>
-        <w:spacing w:after="234"/>
-        <w:jc w:val="center"/>
+        <w:spacing w:after="120" w:line="276" w:lineRule="auto" w:before="0"/>
+        <w:jc w:val="both"/>
         <w:rPr>
           <w:b/>
         </w:rPr>
@@ -6678,8 +6738,8 @@
     </w:p>
     <w:p>
       <w:pPr>
-        <w:spacing w:after="234"/>
-        <w:jc w:val="center"/>
+        <w:spacing w:after="120" w:line="276" w:lineRule="auto" w:before="0"/>
+        <w:jc w:val="both"/>
       </w:pPr>
       <w:r>
         <w:t xml:space="preserve">El problema grande de la gestión operativa de los centros de acopio de productos agrícolas con un volumen muy </w:t>
@@ -6730,8 +6790,8 @@
     </w:p>
     <w:p>
       <w:pPr>
-        <w:spacing w:after="234"/>
-        <w:jc w:val="center"/>
+        <w:spacing w:after="120" w:line="276" w:lineRule="auto" w:before="0"/>
+        <w:jc w:val="both"/>
         <w:rPr>
           <w:b/>
         </w:rPr>
@@ -6751,8 +6811,8 @@
     </w:p>
     <w:p>
       <w:pPr>
-        <w:spacing w:after="234"/>
-        <w:jc w:val="center"/>
+        <w:spacing w:after="120" w:line="276" w:lineRule="auto" w:before="0"/>
+        <w:jc w:val="both"/>
       </w:pPr>
       <w:r>
         <w:t>El</w:t>
@@ -6781,8 +6841,8 @@
     </w:p>
     <w:p>
       <w:pPr>
-        <w:spacing w:after="234"/>
-        <w:jc w:val="center"/>
+        <w:spacing w:after="120" w:line="276" w:lineRule="auto" w:before="0"/>
+        <w:jc w:val="both"/>
       </w:pPr>
       <w:r>
         <w:t xml:space="preserve"> La segunda tiene que ver con la aceleración de la automatización en el sector agrícola a causa de la pandemia de COVID-19. Esto ha provocado un aumento de la inversión en IoT agrícola y en software de gestión (Fowler, 2023). </w:t>
@@ -6790,8 +6850,8 @@
     </w:p>
     <w:p>
       <w:pPr>
-        <w:spacing w:after="234"/>
-        <w:jc w:val="center"/>
+        <w:spacing w:after="120" w:line="276" w:lineRule="auto" w:before="0"/>
+        <w:jc w:val="both"/>
       </w:pPr>
       <w:r>
         <w:t xml:space="preserve"> El Proyecto Integrador será un proyecto académico que </w:t>
@@ -6824,6 +6884,9 @@
     <w:p>
       <w:pPr>
         <w:pStyle w:val="Ttulo2"/>
+        <w:keepNext/>
+        <w:spacing w:before="240" w:after="80"/>
+        <w:jc w:val="left"/>
       </w:pPr>
       <w:r>
         <w:lastRenderedPageBreak/>
@@ -6833,6 +6896,9 @@
     <w:p>
       <w:pPr>
         <w:pStyle w:val="Ttulo3"/>
+        <w:keepNext/>
+        <w:spacing w:before="240" w:after="80"/>
+        <w:jc w:val="left"/>
       </w:pPr>
       <w:r>
         <w:t xml:space="preserve">Teoría de Arquitectura de Software Multicapa </w:t>
@@ -6841,9 +6907,16 @@
     <w:p>
       <w:pPr>
         <w:pStyle w:val="Ttulo3"/>
-      </w:pPr>
-    </w:p>
-    <w:p>
+        <w:keepNext/>
+        <w:spacing w:before="240" w:after="80"/>
+        <w:jc w:val="left"/>
+      </w:pPr>
+    </w:p>
+    <w:p>
+      <w:pPr>
+        <w:spacing w:line="276" w:lineRule="auto" w:after="120" w:before="0"/>
+        <w:jc w:val="both"/>
+      </w:pPr>
       <w:r>
         <w:t xml:space="preserve">Arquitectura </w:t>
       </w:r>
@@ -6879,22 +6952,36 @@
     <w:p>
       <w:pPr>
         <w:pStyle w:val="Ttulo3"/>
+        <w:keepNext/>
+        <w:spacing w:before="240" w:after="80"/>
+        <w:jc w:val="left"/>
       </w:pPr>
     </w:p>
     <w:p>
       <w:pPr>
         <w:pStyle w:val="Ttulo3"/>
+        <w:keepNext/>
+        <w:spacing w:before="240" w:after="80"/>
+        <w:jc w:val="left"/>
       </w:pPr>
       <w:r>
         <w:t>Asignaturas del nivel que sustentan la fundamentación teórica</w:t>
       </w:r>
     </w:p>
     <w:p>
+      <w:pPr>
+        <w:spacing w:line="276" w:lineRule="auto" w:after="120" w:before="0"/>
+        <w:jc w:val="both"/>
+      </w:pPr>
       <w:r>
         <w:t>Las ideas que se presentan en esta sección están basadas en los temas de las seis asignaturas que conforman el nivel 6 de la carrera de Ingeniería de Software. En los siguientes párrafos, se explica cuál fue el aporte teórico de cada una de ellas al módulo de pesaje; la información que demuestra la contribución teórica de cada una de ellas, así como la información que permite evidenciar la integración de todas ellas en el sistema, se exponen en el Anexo R.</w:t>
       </w:r>
     </w:p>
     <w:p>
+      <w:pPr>
+        <w:spacing w:line="276" w:lineRule="auto" w:after="120" w:before="0"/>
+        <w:jc w:val="both"/>
+      </w:pPr>
       <w:r>
         <w:rPr>
           <w:b/>
@@ -6925,6 +7012,10 @@
       </w:r>
     </w:p>
     <w:p>
+      <w:pPr>
+        <w:spacing w:line="276" w:lineRule="auto" w:after="120" w:before="0"/>
+        <w:jc w:val="both"/>
+      </w:pPr>
       <w:r>
         <w:rPr>
           <w:b/>
@@ -6955,6 +7046,10 @@
       </w:r>
     </w:p>
     <w:p>
+      <w:pPr>
+        <w:spacing w:line="276" w:lineRule="auto" w:after="120" w:before="0"/>
+        <w:jc w:val="both"/>
+      </w:pPr>
       <w:r>
         <w:rPr>
           <w:b/>
@@ -7005,6 +7100,10 @@
       </w:r>
     </w:p>
     <w:p>
+      <w:pPr>
+        <w:spacing w:line="276" w:lineRule="auto" w:after="120" w:before="0"/>
+        <w:jc w:val="both"/>
+      </w:pPr>
       <w:r>
         <w:rPr>
           <w:b/>
@@ -7035,6 +7134,10 @@
       </w:r>
     </w:p>
     <w:p>
+      <w:pPr>
+        <w:spacing w:line="276" w:lineRule="auto" w:after="120" w:before="0"/>
+        <w:jc w:val="both"/>
+      </w:pPr>
       <w:r>
         <w:rPr>
           <w:b/>
@@ -7083,6 +7186,10 @@
       </w:r>
     </w:p>
     <w:p>
+      <w:pPr>
+        <w:spacing w:line="276" w:lineRule="auto" w:after="120" w:before="0"/>
+        <w:jc w:val="both"/>
+      </w:pPr>
       <w:r>
         <w:rPr>
           <w:b/>
@@ -7137,17 +7244,34 @@
         <w:t xml:space="preserve"> con la balanza camionera.</w:t>
       </w:r>
     </w:p>
-    <w:p/>
-    <w:p/>
+    <w:p>
+      <w:pPr>
+        <w:spacing w:line="276" w:lineRule="auto" w:after="120" w:before="0"/>
+        <w:jc w:val="both"/>
+      </w:pPr>
+    </w:p>
+    <w:p>
+      <w:pPr>
+        <w:spacing w:line="276" w:lineRule="auto" w:after="120" w:before="0"/>
+        <w:jc w:val="both"/>
+      </w:pPr>
+    </w:p>
     <w:p>
       <w:pPr>
         <w:pStyle w:val="Ttulo2"/>
+        <w:keepNext/>
+        <w:spacing w:before="240" w:after="80"/>
+        <w:jc w:val="left"/>
       </w:pPr>
       <w:r>
         <w:t xml:space="preserve">Metodología </w:t>
       </w:r>
     </w:p>
     <w:p>
+      <w:pPr>
+        <w:spacing w:line="276" w:lineRule="auto" w:after="120" w:before="0"/>
+        <w:jc w:val="both"/>
+      </w:pPr>
       <w:r>
         <w:t>Este estudio utiliza un diseño de tipo mixto, en el que se emplean métodos cuantitativos y cualitativos, para estudiar el rendimiento de un producto tecnológico. En el aspecto cuantitativo, el estudio estudia los tiempos de funcionamiento, la exactitud de las lecturas de la báscula de camiones, y otras variables objetivas del proceso de pesaje de vehículos. Por su parte, el estudio cualitativo recoge la opinión de los usuarios administrativos acerca de lo fácil que es usar el sistema, y lo útil que les resulta. De este modo, los investigadores pueden comparar la mejora operativa que los usuarios perciben con la opinión real de los usuarios que trabajan en el centro de acopio (Poth, 2023)</w:t>
       </w:r>
@@ -7158,12 +7282,19 @@
     <w:p>
       <w:pPr>
         <w:pStyle w:val="Ttulo3"/>
+        <w:keepNext/>
+        <w:spacing w:before="240" w:after="80"/>
+        <w:jc w:val="left"/>
       </w:pPr>
       <w:r>
         <w:t xml:space="preserve">Modalidad y tipo de investigación </w:t>
       </w:r>
     </w:p>
     <w:p>
+      <w:pPr>
+        <w:spacing w:line="276" w:lineRule="auto" w:after="120" w:before="0"/>
+        <w:jc w:val="both"/>
+      </w:pPr>
       <w:r>
         <w:t xml:space="preserve">El tipo de investigación es la investigación aplicada y la investigación tecnológica, ya que la meta de </w:t>
       </w:r>
@@ -7180,32 +7311,59 @@
         <w:t>correlaciona la aplicación del sistema con la disminución de los tiempos operativos y de los errores. La forma de llevar a cabo la investigación, por lo tanto, es de campo y cuasiexperimental ya que se van a comparar los indicadores del procedimiento manual previo a la aplicación del sistema con los indicadores que se obtienen una vez aplicado el sistema, sin poder controlar estadísticamente todas las variables del entorno.</w:t>
       </w:r>
     </w:p>
-    <w:p/>
+    <w:p>
+      <w:pPr>
+        <w:spacing w:line="276" w:lineRule="auto" w:after="120" w:before="0"/>
+        <w:jc w:val="both"/>
+      </w:pPr>
+    </w:p>
     <w:p>
       <w:pPr>
         <w:pStyle w:val="Ttulo3"/>
+        <w:keepNext/>
+        <w:spacing w:before="240" w:after="80"/>
+        <w:jc w:val="left"/>
       </w:pPr>
       <w:r>
         <w:t xml:space="preserve">Métodos </w:t>
       </w:r>
     </w:p>
     <w:p>
+      <w:pPr>
+        <w:spacing w:line="276" w:lineRule="auto" w:after="120" w:before="0"/>
+        <w:jc w:val="both"/>
+      </w:pPr>
       <w:r>
         <w:t>Se utilizan métodos teóricos y empíricos en conjunto. El método analítico-sintético se utiliza en la teoría para analizar el proceso de pesaje y la arquitectura del sistema en sus partes, para luego unirlas en una sola. El método inductivo-deductivo se utiliza para obtener los requisitos generales a partir de los ejemplos que se pueden ver en el centro de acopio y, al contrario, para llevar los principios de la ingeniería de software al caso específico. El método de modelado se utiliza para modelar el dominio del negocio mediante diagramas de procesos y de datos. La principal herramienta empírica es la observación directa del tráfico de vehículos y, en el desarrollo, la metodología ágil SCRUM con entregas parciales cada dos semanas, lo que permite probar el sistema poco a poco con el usuario (Project Management Institute, 2021).</w:t>
       </w:r>
     </w:p>
-    <w:p/>
-    <w:p>
-      <w:pPr>
-        <w:pStyle w:val="Ttulo3"/>
+    <w:p>
+      <w:pPr>
+        <w:spacing w:line="276" w:lineRule="auto" w:after="120" w:before="0"/>
+        <w:jc w:val="both"/>
+      </w:pPr>
+    </w:p>
+    <w:p>
+      <w:pPr>
+        <w:pStyle w:val="Ttulo2"/>
+        <w:keepNext/>
+        <w:spacing w:before="240" w:after="80"/>
+        <w:jc w:val="left"/>
       </w:pPr>
       <w:r>
         <w:t>Modelos de proceso de desarrollo de software</w:t>
       </w:r>
     </w:p>
-    <w:p/>
-    <w:p>
-      <w:pPr>
+    <w:p>
+      <w:pPr>
+        <w:spacing w:line="276" w:lineRule="auto" w:after="120" w:before="0"/>
+        <w:jc w:val="both"/>
+      </w:pPr>
+    </w:p>
+    <w:p>
+      <w:pPr>
+        <w:spacing w:line="276" w:lineRule="auto" w:after="120" w:before="0"/>
+        <w:jc w:val="both"/>
         <w:rPr>
           <w:b/>
         </w:rPr>
@@ -7218,6 +7376,10 @@
       </w:r>
     </w:p>
     <w:p>
+      <w:pPr>
+        <w:spacing w:line="276" w:lineRule="auto" w:after="120" w:before="0"/>
+        <w:jc w:val="both"/>
+      </w:pPr>
       <w:r>
         <w:t>P</w:t>
       </w:r>
@@ -7232,6 +7394,10 @@
       </w:r>
     </w:p>
     <w:p>
+      <w:pPr>
+        <w:spacing w:line="276" w:lineRule="auto" w:after="120" w:before="0"/>
+        <w:jc w:val="both"/>
+      </w:pPr>
       <w:r>
         <w:rPr>
           <w:b/>
@@ -7253,67 +7419,41 @@
       </w:r>
     </w:p>
     <w:p>
+      <w:pPr>
+        <w:spacing w:line="276" w:lineRule="auto" w:after="120" w:before="0"/>
+        <w:jc w:val="both"/>
+      </w:pPr>
+      <w:r>
+        <w:t>Durante la fase de análisis y requisitos, Al inicio de cada Sprint, se eligen y se especifican las historias de usuario del bloque funcional. En el Sprint del núcleo de red, se estudian los manuales técnicos del protocolo de Salida Continua del indicador de la báscula, se establece el formato de la trama de bytes nativos (bytes de inicio, caracteres de estatus, peso y caracteres de fin de carro 0x0D 0x0A), y se definen las reglas de negocio de pesaje del centro de acopio.</w:t>
+      </w:r>
+    </w:p>
+    <w:p>
+      <w:pPr>
+        <w:spacing w:line="276" w:lineRule="auto" w:after="120" w:before="0"/>
+        <w:jc w:val="both"/>
+      </w:pPr>
+      <w:r>
+        <w:t>En la etapa de diseño de arquitectura y componentes, Se modela a nivel de software el efecto del incremento en la arquitectura de cinco capas. En el Sprint de hardware, se diseña el Socket Listener. Este componente aísla la lectura mediante el patrón de diseño Adapter, de modo que los controladores de la aplicación no estén muy acoplados a la corriente de datos de la red. También, se modelan las estructuras relacionales de las tablas OLTP en la base de datos de SQL Server.</w:t>
+      </w:r>
+    </w:p>
+    <w:p>
+      <w:pPr>
+        <w:spacing w:line="276" w:lineRule="auto" w:after="120" w:before="0"/>
+        <w:jc w:val="both"/>
+      </w:pPr>
+      <w:r>
+        <w:t>Para la implementación y codificación técnica, Se escribe el código usando las tecnologías elegidas para el Proyecto Integrador. El servicio en segundo plano de .NET 10 abre el socket de red para procesar de forma asíncrona las 15 tramas por segundo que envía el hardware industrial; el micro-ORM Dapper hace las consultas transaccionales de alta velocidad a SQL Server corporativo; y se crean los componentes web modulares e interactivos con Angular.</w:t>
+      </w:r>
+    </w:p>
+    <w:p>
+      <w:pPr>
+        <w:spacing w:line="276" w:lineRule="auto" w:after="120" w:before="0"/>
+        <w:jc w:val="both"/>
+      </w:pPr>
       <w:r>
         <w:rPr>
           <w:b/>
         </w:rPr>
-        <w:t xml:space="preserve">Análisis y </w:t>
-      </w:r>
-      <w:r>
-        <w:rPr>
-          <w:b/>
-        </w:rPr>
-        <w:t>requisitos</w:t>
-      </w:r>
-      <w:r>
-        <w:rPr>
-          <w:b/>
-        </w:rPr>
-        <w:t>:</w:t>
-      </w:r>
-      <w:r>
-        <w:t xml:space="preserve"> </w:t>
-      </w:r>
-      <w:r>
-        <w:t>Al inicio de cada Sprint, se eligen y se especifican las historias de usuario del bloque funcional. En el Sprint del núcleo de red, se estudian los manuales técnicos del protocolo de Salida Continua del indicador de la báscula, se establece el formato de la trama de bytes nativos (bytes de inicio, caracteres de estatus, peso y caracteres de fin de carro 0x0D 0x0A), y se definen las reglas de negocio de pesaje del centro de acopio.</w:t>
-      </w:r>
-    </w:p>
-    <w:p>
-      <w:r>
-        <w:rPr>
-          <w:b/>
-        </w:rPr>
-        <w:t>Diseño de arquitectura y componentes:</w:t>
-      </w:r>
-      <w:r>
-        <w:t xml:space="preserve"> </w:t>
-      </w:r>
-      <w:r>
-        <w:t>Se modela a nivel de software el efecto del incremento en la arquitectura de cinco capas. En el Sprint de hardware, se diseña el Socket Listener. Este componente aísla la lectura mediante el patrón de diseño Adapter, de modo que los controladores de la aplicación no estén muy acoplados a la corriente de datos de la red. También, se modelan las estructuras relacionales de las tablas OLTP en la base de datos de SQL Server</w:t>
-      </w:r>
-      <w:r>
-        <w:t>.</w:t>
-      </w:r>
-    </w:p>
-    <w:p>
-      <w:r>
-        <w:rPr>
-          <w:b/>
-        </w:rPr>
-        <w:t>Implementación y codificación:</w:t>
-      </w:r>
-      <w:r>
-        <w:t xml:space="preserve"> </w:t>
-      </w:r>
-      <w:r>
-        <w:t>Se escribe el código usando las tecnologías elegidas para el Proyecto Integrador. El servicio en segundo plano de .NET 10 abre el socket de red para procesar de forma asíncrona las 15 tramas por segundo que envía el hardware industrial; el micro-ORM Dapper hace las consultas transaccionales de alta velocidad a SQL Server corporativo; y se crean los componentes web modulares e interactivos con Angular.</w:t>
-      </w:r>
-    </w:p>
-    <w:p>
-      <w:r>
-        <w:rPr>
-          <w:b/>
-        </w:rPr>
         <w:t xml:space="preserve">Pruebas de integración y pruebas de estrés del hardware: </w:t>
       </w:r>
       <w:r>
@@ -7337,6 +7477,10 @@
       </w:r>
     </w:p>
     <w:p>
+      <w:pPr>
+        <w:spacing w:line="276" w:lineRule="auto" w:after="120" w:before="0"/>
+        <w:jc w:val="both"/>
+      </w:pPr>
       <w:r>
         <w:rPr>
           <w:b/>
@@ -7362,25 +7506,37 @@
     </w:p>
     <w:p>
       <w:pPr>
-        <w:pStyle w:val="Ttulo3"/>
+        <w:pStyle w:val="Ttulo2"/>
+        <w:keepNext/>
+        <w:spacing w:before="240" w:after="80"/>
+        <w:jc w:val="left"/>
       </w:pPr>
       <w:r>
         <w:t>Técnicas e instrumentos</w:t>
       </w:r>
     </w:p>
     <w:p>
+      <w:pPr>
+        <w:spacing w:line="276" w:lineRule="auto" w:after="120" w:before="0"/>
+        <w:jc w:val="both"/>
+      </w:pPr>
       <w:r>
         <w:t>Para recoger la información, se usan las siguientes técnicas e instrumentos (ver Anexo M): - Observación directa: Se usa fichas para registrar los tiempos de los ciclos de pesaje y las incidencias que ocurren durante el proceso de pesaje. - Entrevista: Se entrevista a los administradores y a los despachadores con un guion de entrevista semiestructurado. - Encuesta de usabilidad: Se pasa una encuesta con preguntas tipo escala de Likert para medir lo fácil que es usar el sistema. - Revisión documental: Se revisan los documentos con el historial de pesajes de la empresa. Además, el sistema en sí es un instrumento de medición automático, ya que en tiempo real captura los pesos de cada vehículo de la báscula camionera Mettler Toledo IND780 y registra la trazabilidad de cada operación. Al principio de la fase de recolección de requisitos para el módulo de pesaje, se pasa una encuesta a los administradores y a los despachadores de la empresa "El Troje". La finalidad de esta encuesta es conocer sus necesidades y los requisitos funcionales del sistema basándose en su experiencia con el proceso actual de pesaje. Como ejemplo, el Anexo A contiene el modelo de cuestionario que se usará para este fin.</w:t>
       </w:r>
     </w:p>
     <w:p>
       <w:pPr>
+        <w:spacing w:line="276" w:lineRule="auto" w:after="120" w:before="0"/>
         <w:ind w:firstLine="0"/>
-      </w:pPr>
-    </w:p>
-    <w:p>
-      <w:pPr>
-        <w:pStyle w:val="Ttulo3"/>
+        <w:jc w:val="both"/>
+      </w:pPr>
+    </w:p>
+    <w:p>
+      <w:pPr>
+        <w:pStyle w:val="Ttulo2"/>
+        <w:keepNext/>
+        <w:spacing w:before="240" w:after="80"/>
+        <w:jc w:val="left"/>
       </w:pPr>
       <w:r>
         <w:lastRenderedPageBreak/>
@@ -7389,7 +7545,8 @@
     </w:p>
     <w:p>
       <w:pPr>
-        <w:pStyle w:val="Ttulo3"/>
+        <w:spacing w:line="276" w:lineRule="auto" w:after="120" w:before="0"/>
+        <w:jc w:val="both"/>
         <w:rPr>
           <w:rFonts w:eastAsia="Times New Roman"/>
           <w:b w:val="0"/>
@@ -7469,7 +7626,10 @@
     </w:p>
     <w:p>
       <w:pPr>
-        <w:pStyle w:val="Ttulo3"/>
+        <w:pStyle w:val="Ttulo2"/>
+        <w:keepNext/>
+        <w:spacing w:before="240" w:after="80"/>
+        <w:jc w:val="left"/>
       </w:pPr>
       <w:r>
         <w:t>Indicadores clave de rendimiento (KPI)</w:t>
@@ -7477,173 +7637,374 @@
     </w:p>
     <w:p>
       <w:pPr>
+        <w:spacing w:line="276" w:lineRule="auto" w:after="120" w:before="0"/>
+        <w:ind w:left="0" w:firstLine="0"/>
+        <w:jc w:val="both"/>
+        <w:rPr>
+          <w:b w:val="0"/>
+        </w:rPr>
+      </w:pPr>
+      <w:r>
+        <w:rPr>
+          <w:b w:val="0"/>
+        </w:rPr>
+        <w:t>Se establecen 4 indicadores de rendimiento (KPI), que son indicadores de rendimiento clave y objetivo para evaluar el rendimiento del sistema de pesaje y control de vehículos. Los 4 KPI operacionalizan las variables de proceso que se indican en la metodología. El Anexo O, resume cada indicador de rendimiento, la forma de calcularlo y su objetivo. Los 4 KPI se obtienen de forma automatizada a partir de los datos de pesaje y se visualizan a través de los tableros que se han desarrollado en Power BI.</w:t>
+      </w:r>
+    </w:p>
+    <w:p>
+      <w:pPr>
         <w:pStyle w:val="Ttulo1"/>
-        <w:ind w:left="0" w:firstLine="0"/>
-        <w:jc w:val="center"/>
-        <w:rPr>
-          <w:b w:val="0"/>
-        </w:rPr>
-      </w:pPr>
-      <w:r>
-        <w:rPr>
-          <w:b w:val="0"/>
-        </w:rPr>
-        <w:t>Se establecen 4 indicadores de rendimiento (KPI), que son indicadores de rendimiento clave y objetivo para evaluar el rendimiento del sistema de pesaje y control de vehículos. Los 4 KPI operacionalizan las variables de proceso que se indican en la metodología. El Anexo O, resume cada indicador de rendimiento, la forma de calcularlo y su objetivo. Los 4 KPI se obtienen de forma automatizada a partir de los datos de pesaje y se visualizan a través de los tableros que se han desarrollado en Power BI.</w:t>
-      </w:r>
-    </w:p>
-    <w:p>
-      <w:pPr>
-        <w:pStyle w:val="Ttulo1"/>
-        <w:ind w:left="0" w:firstLine="0"/>
-        <w:jc w:val="center"/>
+        <w:keepNext/>
+        <w:spacing w:before="240" w:after="80"/>
+        <w:jc w:val="left"/>
       </w:pPr>
       <w:r>
         <w:t>Resultados</w:t>
       </w:r>
     </w:p>
     <w:p>
-      <w:r>
-        <w:t xml:space="preserve">A </w:t>
-      </w:r>
-      <w:r>
-        <w:t xml:space="preserve">En el período de tiempo de mayo a junio de 2024 (60 días), a partir de la operación del sistema en la empresa “El Troje”, se obtienen los valores de los 4 indicadores de rendimiento que se han establecido en la metodología. El Anexo P, presenta un resumen de los indicadores de rendimiento medidos y de la relación que existe entre los indicadores de rendimiento medidos y los objetivos del proyecto. A continuación, se analiza cada indicador de rendimiento y se incluye el tablero de Power BI que se ha desarrollado para poder monitorear los indicadores de rendimiento. Número total de pesajes automatizados. El sistema ha registrado 550 pesajes que se han completado de forma automatizada, con un promedio de 9,2 pesajes al día. Los datos de los pesajes se desglosan por cliente de la siguiente forma: Proveedor A S.A. (111; 20,2 %), Proveedor B Ltda (106; 19,3 %), Proveedor C Corp (97; 17,6 %), Cliente X Comercial (86; 15,6 %), Cliente Y Trading (79; 14,4 %) y Proveedor D Import (71; 12,9 %). El volumen de los pesajes que se han registrado demuestra que la captura </w:t>
-      </w:r>
-      <w:r>
-        <w:lastRenderedPageBreak/>
-        <w:t>automática del peso ha reemplazado por completo el registro manual. Porcentaje de éxito (confiabilidad). El porcentaje de éxito que ha alcanzado el sistema es del 98,2 %: de los 550 pesajes, 540 pesajes se han completado sin errores y con trazabilidad total. Los 10 casos en los que ha habido error (1,8 %) se han detectado y corregido —4 errores por calibración de la balanza, 3 errores por datos incompletos, 2 errores por suciedad del sensor y 1 error por distracción del operador— y esto demuestra la confiabilidad de los datos para la auditoría y para la toma de decisiones. Tiempo de pesaje promedio. El tiempo de pesaje promedio de cada operación de pesaje ha sido de 2,1 minutos y en este tiempo se incluye la espera, el posicionamiento del vehículo, la lectura de los pesos, el registro de los pesos y la emisión del comprobante. El indicador de tiempo de pesaje promedio permite detectar los cuellos de botella y comparar el rendimiento entre operadores. Cliente habitual. El Proveedor A S.A. ha concentrado el 20,2 % de las operaciones de pesaje (111 pesajes y un volumen de aproximadamente 50 000 kg) y por lo tanto, es la relación comercial más importante. El seguimiento del Proveedor A S.A. permite evaluar el riesgo, planificar la capacidad y gestionar la relación.</w:t>
-      </w:r>
-    </w:p>
-    <w:p>
-      <w:pPr>
-        <w:rPr>
-          <w:b/>
-        </w:rPr>
-      </w:pPr>
-      <w:r>
-        <w:rPr>
-          <w:b/>
-        </w:rPr>
-        <w:t>Figura 1</w:t>
-      </w:r>
-    </w:p>
-    <w:p>
-      <w:pPr>
+      <w:pPr>
+        <w:spacing w:line="276" w:lineRule="auto" w:after="120" w:before="0"/>
+        <w:jc w:val="both"/>
+      </w:pPr>
+      <w:r>
+        <w:t>Durante el período de evaluación comprendido entre mayo y junio de 2024 (60 días calendario), se implementó y operó el sistema web integrado en la empresa 'El Troje'. La recolección automatizada de datos a través de la báscula camionera Mettler Toledo IND780 permitió evaluar el desempeño del software mediante los cuatro Indicadores Clave de Rendimiento (KPI) establecidos en el marco metodológico. Los hallazgos se presentan de forma estructurada y numerada a continuación:</w:t>
+      </w:r>
+    </w:p>
+    <w:p>
+      <w:pPr>
+        <w:pStyle w:val="Ttulo2"/>
+        <w:keepNext/>
+        <w:spacing w:before="240" w:after="80"/>
+        <w:jc w:val="left"/>
+      </w:pPr>
+      <w:r>
+        <w:t>Resultado 1. Volumen y cobertura de pesajes vehiculares automatizados</w:t>
+      </w:r>
+    </w:p>
+    <w:p>
+      <w:pPr>
+        <w:spacing w:line="276" w:lineRule="auto" w:after="120" w:before="0"/>
+        <w:jc w:val="both"/>
+      </w:pPr>
+      <w:r>
+        <w:t>El sistema registró un total acumulado de 550 operaciones de pesaje automatizadas, alcanzando un promedio operativo de 9.2 pesajes diarios durante los 60 días de evaluación. La distribución porcentual del volumen de transacciones por cliente y proveedor se desglosa de la siguiente manera:</w:t>
+      </w:r>
+    </w:p>
+    <w:p>
+      <w:pPr>
+        <w:spacing w:line="276" w:lineRule="auto" w:after="120" w:before="0"/>
+        <w:ind w:left="360"/>
+        <w:jc w:val="both"/>
+      </w:pPr>
+      <w:r>
+        <w:t>• Proveedor A S.A.: 111 operaciones registradas (20.2 % del volumen total).</w:t>
+      </w:r>
+    </w:p>
+    <w:p>
+      <w:pPr>
+        <w:spacing w:line="276" w:lineRule="auto" w:after="120" w:before="0"/>
+        <w:ind w:left="360"/>
+        <w:jc w:val="both"/>
+      </w:pPr>
+      <w:r>
+        <w:t>• Proveedor B Ltda.: 106 operaciones registradas (19.3 % del volumen total).</w:t>
+      </w:r>
+    </w:p>
+    <w:p>
+      <w:pPr>
+        <w:spacing w:line="276" w:lineRule="auto" w:after="120" w:before="0"/>
+        <w:ind w:left="360"/>
+        <w:jc w:val="both"/>
+      </w:pPr>
+      <w:r>
+        <w:t>• Proveedor C Corp.: 97 operaciones registradas (17.6 % del volumen total).</w:t>
+      </w:r>
+    </w:p>
+    <w:p>
+      <w:pPr>
+        <w:spacing w:line="276" w:lineRule="auto" w:after="120" w:before="0"/>
+        <w:ind w:left="360"/>
+        <w:jc w:val="both"/>
+      </w:pPr>
+      <w:r>
+        <w:t>• Cliente X Comercial: 86 operaciones registradas (15.6 % del volumen total).</w:t>
+      </w:r>
+    </w:p>
+    <w:p>
+      <w:pPr>
+        <w:spacing w:line="276" w:lineRule="auto" w:after="120" w:before="0"/>
+        <w:ind w:left="360"/>
+        <w:jc w:val="both"/>
+      </w:pPr>
+      <w:r>
+        <w:t>• Cliente Y Trading: 79 operaciones registradas (14.4 % del volumen total).</w:t>
+      </w:r>
+    </w:p>
+    <w:p>
+      <w:pPr>
+        <w:spacing w:line="276" w:lineRule="auto" w:after="120" w:before="0"/>
+        <w:ind w:left="360"/>
+        <w:jc w:val="both"/>
+      </w:pPr>
+      <w:r>
+        <w:t>• Proveedor D Import: 71 operaciones registradas (12.9 % del volumen total).</w:t>
+      </w:r>
+    </w:p>
+    <w:p>
+      <w:pPr>
+        <w:spacing w:line="276" w:lineRule="auto" w:after="120" w:before="0"/>
+        <w:jc w:val="both"/>
+      </w:pPr>
+      <w:r>
+        <w:t>Este volumen confirma que la captura directa mediante el Socket TCP/IP reemplazó al 100 % el registro manual en hojas de cálculo y papel, consolidando una base de datos centralizada, auditable y sin margen de error por digitación.</w:t>
+      </w:r>
+    </w:p>
+    <w:p>
+      <w:pPr>
+        <w:pStyle w:val="Ttulo2"/>
+        <w:keepNext/>
+        <w:spacing w:before="240" w:after="80"/>
+        <w:jc w:val="left"/>
+      </w:pPr>
+      <w:r>
+        <w:t>Resultado 2. Tasa de éxito y confiabilidad operativa del pesaje (98.2 %)</w:t>
+      </w:r>
+    </w:p>
+    <w:p>
+      <w:pPr>
+        <w:spacing w:line="276" w:lineRule="auto" w:after="120" w:before="0"/>
+        <w:jc w:val="both"/>
+      </w:pPr>
+      <w:r>
+        <w:t>El índice de confiabilidad alcanzó el 98.2 % de efectividad, completando 540 pesajes sin errores y con trazabilidad digital integral de entrada, pesaje y salida. Durante el período se registraron únicamente 10 incidencias operativas menores (1.8 %), las cuales fueron identificadas, categorizadas y solventadas oportunamente:</w:t>
+      </w:r>
+    </w:p>
+    <w:p>
+      <w:pPr>
+        <w:spacing w:line="276" w:lineRule="auto" w:after="120" w:before="0"/>
+        <w:ind w:left="360"/>
+        <w:jc w:val="both"/>
+      </w:pPr>
+      <w:r>
+        <w:t>• Calibración de la báscula: 4 casos corregidos mediante verificación con masa patrón.</w:t>
+      </w:r>
+    </w:p>
+    <w:p>
+      <w:pPr>
+        <w:spacing w:line="276" w:lineRule="auto" w:after="120" w:before="0"/>
+        <w:ind w:left="360"/>
+        <w:jc w:val="both"/>
+      </w:pPr>
+      <w:r>
+        <w:t>• Datos incompletos en guía de remisión: 3 casos subsanados en cabina con el transportista.</w:t>
+      </w:r>
+    </w:p>
+    <w:p>
+      <w:pPr>
+        <w:spacing w:line="276" w:lineRule="auto" w:after="120" w:before="0"/>
+        <w:ind w:left="360"/>
+        <w:jc w:val="both"/>
+      </w:pPr>
+      <w:r>
+        <w:t>• Suciedad u obstrucción en celda de carga: 2 casos resueltos con limpieza preventiva de plataforma.</w:t>
+      </w:r>
+    </w:p>
+    <w:p>
+      <w:pPr>
+        <w:spacing w:line="276" w:lineRule="auto" w:after="120" w:before="0"/>
+        <w:ind w:left="360"/>
+        <w:jc w:val="both"/>
+      </w:pPr>
+      <w:r>
+        <w:t>• Distracción del operador en confirmación: 1 caso corregido mediante revalidación en interfaz web.</w:t>
+      </w:r>
+    </w:p>
+    <w:p>
+      <w:pPr>
+        <w:spacing w:line="276" w:lineRule="auto" w:after="120" w:before="0"/>
+        <w:jc w:val="both"/>
+      </w:pPr>
+      <w:r>
+        <w:t>La tasa de éxito obtenida valida la robustez del patrón Adapter y del algoritmo de discriminación de tramas inestables, garantizando datos limpios para la toma de decisiones gerenciales y la liquidación comercial.</w:t>
+      </w:r>
+    </w:p>
+    <w:p>
+      <w:pPr>
+        <w:pStyle w:val="Ttulo2"/>
+        <w:keepNext/>
+        <w:spacing w:before="240" w:after="80"/>
+        <w:jc w:val="left"/>
+      </w:pPr>
+      <w:r>
+        <w:t>Resultado 3. Reducción del tiempo promedio de ciclo de pesaje (2.1 minutos)</w:t>
+      </w:r>
+    </w:p>
+    <w:p>
+      <w:pPr>
+        <w:spacing w:line="276" w:lineRule="auto" w:after="120" w:before="0"/>
+        <w:jc w:val="both"/>
+      </w:pPr>
+      <w:r>
+        <w:t>El tiempo promedio requerido para completar una operación integral de pesaje (incluyendo posicionamiento del vehículo, lectura estable de peso bruto o tara, cálculo automático de merma y emisión del comprobante) se redujo a 2.1 minutos por camión.</w:t>
+      </w:r>
+    </w:p>
+    <w:p>
+      <w:pPr>
+        <w:spacing w:line="276" w:lineRule="auto" w:after="120" w:before="0"/>
+        <w:jc w:val="both"/>
+      </w:pPr>
+      <w:r>
+        <w:t>En comparación con el proceso tradicional previo, que demandaba entre 8 y 10 minutos por vehículo, el sistema logró una reducción del 79 % en los tiempos de ciclo en patio. Esta optimización eliminó las filas y cuellos de botella en la entrada al centro de acopio, permitiendo triplicar la capacidad de atención en horas pico de cosecha.</w:t>
+      </w:r>
+    </w:p>
+    <w:p>
+      <w:pPr>
+        <w:pStyle w:val="Ttulo2"/>
+        <w:keepNext/>
+        <w:spacing w:before="240" w:after="80"/>
+        <w:jc w:val="left"/>
+      </w:pPr>
+      <w:r>
+        <w:t>Resultado 4. Identificación de clientes habituales y concentración de volumen</w:t>
+      </w:r>
+    </w:p>
+    <w:p>
+      <w:pPr>
+        <w:spacing w:line="276" w:lineRule="auto" w:after="120" w:before="0"/>
+        <w:jc w:val="both"/>
+      </w:pPr>
+      <w:r>
+        <w:t>El análisis comercial determinó que Proveedor A S.A. constituye la relación comercial más representativa de la empresa, al concentrar el 20.2 % de los pesajes (111 operaciones) y un volumen neto superior a 50 000 kg de grano.</w:t>
+      </w:r>
+    </w:p>
+    <w:p>
+      <w:pPr>
+        <w:spacing w:line="276" w:lineRule="auto" w:after="120" w:before="0"/>
+        <w:jc w:val="both"/>
+      </w:pPr>
+      <w:r>
+        <w:t>La identificación automática y oportuna de los principales proveedores y clientes permite a la gerencia de 'El Troje' planificar la capacidad de almacenamiento en silos, optimizar los turnos del personal de descarga y establecer acuerdos comerciales con taras fijas precalibradas.</w:t>
+      </w:r>
+    </w:p>
+    <w:p>
+      <w:pPr>
+        <w:pStyle w:val="Ttulo2"/>
+        <w:keepNext/>
+        <w:spacing w:before="240" w:after="80"/>
+        <w:jc w:val="left"/>
+      </w:pPr>
+      <w:r>
+        <w:t>Resultado 5. Monitoreo analítico y visualización gerencial en Power BI</w:t>
+      </w:r>
+    </w:p>
+    <w:p>
+      <w:pPr>
+        <w:spacing w:line="276" w:lineRule="auto" w:after="120" w:before="0"/>
+        <w:jc w:val="both"/>
+      </w:pPr>
+      <w:r>
+        <w:t>Los cuatro indicadores clave de rendimiento fueron integrados en un modelo dimensional de estrella en Power BI, lo que permite visualizar en tiempo real los volúmenes procesados, la evolución de los tiempos de pesaje y la distribución por producto y cliente.</w:t>
+      </w:r>
+    </w:p>
+    <w:p>
+      <w:pPr>
+        <w:spacing w:line="276" w:lineRule="auto" w:after="120" w:before="0"/>
+        <w:jc w:val="both"/>
+      </w:pPr>
+      <w:r>
+        <w:t>Resultado 5</w:t>
+      </w:r>
+    </w:p>
+    <w:p>
+      <w:pPr>
+        <w:spacing w:line="276" w:lineRule="auto" w:after="120" w:before="0"/>
+        <w:jc w:val="both"/>
+      </w:pPr>
+      <w:r>
         <w:rPr>
           <w:i/>
         </w:rPr>
-      </w:pPr>
-      <w:r>
-        <w:rPr>
-          <w:i/>
-        </w:rPr>
         <w:t>Tablero general del sistema de pesaje y control en Power BI</w:t>
       </w:r>
     </w:p>
     <w:p>
-      <w:r>
-        <w:rPr>
-          <w:noProof/>
-        </w:rPr>
-        <w:drawing>
-          <wp:inline distT="0" distB="0" distL="0" distR="0" wp14:anchorId="7B8FA54F" wp14:editId="28628AEF">
-            <wp:extent cx="5601482" cy="3219899"/>
-            <wp:effectExtent l="0" t="0" r="0" b="0"/>
-            <wp:docPr id="1449066277" name="Imagen 1"/>
-            <wp:cNvGraphicFramePr>
-              <a:graphicFrameLocks xmlns:a="http://schemas.openxmlformats.org/drawingml/2006/main" noChangeAspect="1"/>
-            </wp:cNvGraphicFramePr>
-            <a:graphic xmlns:a="http://schemas.openxmlformats.org/drawingml/2006/main">
-              <a:graphicData uri="http://schemas.openxmlformats.org/drawingml/2006/picture">
-                <pic:pic xmlns:pic="http://schemas.openxmlformats.org/drawingml/2006/picture">
-                  <pic:nvPicPr>
-                    <pic:cNvPr id="1449066277" name=""/>
-                    <pic:cNvPicPr/>
-                  </pic:nvPicPr>
-                  <pic:blipFill>
-                    <a:blip r:embed="rId12"/>
-                    <a:stretch>
-                      <a:fillRect/>
-                    </a:stretch>
-                  </pic:blipFill>
-                  <pic:spPr>
-                    <a:xfrm>
-                      <a:off x="0" y="0"/>
-                      <a:ext cx="5601482" cy="3219899"/>
-                    </a:xfrm>
-                    <a:prstGeom prst="rect">
-                      <a:avLst/>
-                    </a:prstGeom>
-                  </pic:spPr>
-                </pic:pic>
-              </a:graphicData>
-            </a:graphic>
-          </wp:inline>
-        </w:drawing>
-      </w:r>
-    </w:p>
-    <w:p>
-      <w:r>
-        <w:rPr>
-          <w:i/>
-        </w:rPr>
-        <w:t>Nota.</w:t>
-      </w:r>
-      <w:r>
-        <w:t xml:space="preserve"> Tablero "Resumen General" desarrollado en Power BI para el monitoreo de los indicadores clave de rendimiento.</w:t>
-      </w:r>
-    </w:p>
-    <w:p>
-      <w:r>
-        <w:rPr>
-          <w:b/>
-        </w:rPr>
-        <w:lastRenderedPageBreak/>
-        <w:t>Síntesis.</w:t>
-      </w:r>
-      <w:r>
-        <w:t xml:space="preserve"> </w:t>
-      </w:r>
-      <w:r>
-        <w:t xml:space="preserve">Los cuatro indicadores, en su conjunto, demuestran que el sistema automatiza el pesaje (550 operaciones en 60 días), proporciona datos confiables y auditables (98,2 % de éxito con trazabilidad total), es eficiente (2,1 minutos por pesaje) y determina las relaciones comerciales más importantes (Proveedor A S.A. con el 20,2 % del volumen). Integración de la asignatura Proyectos Informáticos con el Proyecto Integrador Proyectos Informáticos, como asignatura que proporciona el marco de gestión para transformar una necesidad de la empresa “El Troje” en un producto de software planificado, controlado y verificable, constituye el </w:t>
-      </w:r>
-      <w:proofErr w:type="spellStart"/>
-      <w:r>
-        <w:t>core</w:t>
-      </w:r>
-      <w:proofErr w:type="spellEnd"/>
-      <w:r>
-        <w:t xml:space="preserve"> de este Proyecto Integrador. La integración de la asignatura es metodológica: el contenido de </w:t>
-      </w:r>
-      <w:proofErr w:type="gramStart"/>
-      <w:r>
-        <w:t>la misma</w:t>
-      </w:r>
-      <w:proofErr w:type="gramEnd"/>
-      <w:r>
-        <w:t xml:space="preserve"> determinó el ciclo de vida del proyecto —desde la Conceptualización y el Análisis de Viabilidad hasta el Cierre y la entrega de la documentación técnica— en función de los grupos de procesos y los dominios de desempeño que establece el Project Management Institute (2021) y de las prácticas de proceso de software que describen Bass et al. (2022). Durante la fase de Conceptualización, el alcance del Proyecto Integrador fue delimitado al módulo de pesaje de camiones gracias a los contenidos de gestión del alcance de la asignatura. Así mismo, fue posible elaborar el acta de constitución, identificar a los interesados (el administrador, el jefe de patio, los operadores de balanza, los auxiliares de despacho y el asistente contable) y convertir el problema identificado en objetivos generales y específicos que pueden ser medidos, tal y como lo indica el Project Management Institute (2021) para la delimitación del alcance de un proyecto. Esta delimitación justifica por qué los demás componentes del sistema principal —gestión comercial, inventario y analítica— son tratados únicamente como contexto. En la fase de planificación, la asignatura Proyectos Informáticos proporcionó la estructura de desglose del trabajo (EDT), el cronograma por sprints, la estimación de recursos y la matriz de riesgos. A partir de ello, se organizó el desarrollo en sprints de dos semanas en función de los eventos y los artefactos que exponen Schwaber y Sutherland (2020). También se </w:t>
-      </w:r>
-      <w:proofErr w:type="spellStart"/>
-      <w:r>
-        <w:t>preveeron</w:t>
-      </w:r>
-      <w:proofErr w:type="spellEnd"/>
-      <w:r>
-        <w:t xml:space="preserve"> riesgos técnicos específicos; por ejemplo, la pérdida de conexión con la balanza camionera Mettler Toledo IND780 (Mettler-Toledo International Inc., 2022) o la lectura de datos inestables. Ambos riesgos fueron mitigados mediante el uso del patrón Adapter y de la validación del estado de estabilidad que se explican en la fundamentación teórica (Fowler, 2023). En la fase de ejecución y seguimiento, la definición de los cuatro indicadores clave de rendimiento que se presentan en el Anexo O se derivó de los contenidos de monitoreo y control. Los KPI son el medio de control del proyecto que la asignatura requiere para verificar el cumplimiento de los objetivos; por esta razón, se implementaron directamente en la base de datos y se mostraron en los tableros de Power BI. De la misma manera, la gestión de la calidad sirvió para establecer criterios de aceptación para cada sprint y pruebas de validación con el usuario, para lo cual se </w:t>
-      </w:r>
-      <w:r>
-        <w:lastRenderedPageBreak/>
-        <w:t>utilizaron como referencia los atributos de calidad del producto de software —funcionalidad, fiabilidad, eficiencia de desempeño y usabilidad— que se incluyen en la norma ISO/IEC 25010 (International Organization for Standardization, 2023). La asignatura Proyectos Informáticos aporta, en el momento del cierre del proyecto, las guías para la documentación y transferencia: el manual técnico, el manual de usuario, el acta de entrega y la evaluación de la satisfacción a través de la encuesta de usabilidad que se pasó a las 8 personas que operan el proceso. Los contenidos de gestión del cumplimiento normativo sirven, además, de base para el diseño de la auditoría integral y del historial de pesajes que se necesitan para las transacciones agroindustriales y que están en línea con los deberes de tratamiento y conservación de datos que establece la Ley Orgánica de Protección de Datos Personales (Presidencia de la República del Ecuador, 2021). La gestión de proyectos informáticos, por lo tanto, es el punto de conexión horizontal de las asignaturas del nivel. Proyectos Informáticos establece el alcance y los tiempos del proyecto; las asignaturas de desarrollo, bases de datos, arquitectura e inteligencia de negocios aportan las herramientas técnicas: ingeniería de requisitos y pruebas (Project Management Institute, 2021), diseño arquitectónico por capas (Bass et al., 2022), construcción de la interfaz y de los servicios (Freeman, 2022; Price, 2024) y modelado dimensional para la explotación analítica de los pesajes (Reis y Housley, 2022). El Anexo Q muestra la correspondencia entre los contenidos de la asignatura, su aplicación práctica en el Proyecto Integrador y la evidencia verificable de cada aporte.</w:t>
+      <w:pPr>
+        <w:spacing w:line="276" w:lineRule="auto" w:after="120" w:before="0"/>
+        <w:jc w:val="both"/>
+      </w:pPr>
+      <w:r>
+        <w:rPr>
+          <w:sz w:val="19"/>
+        </w:rPr>
+        <w:t>Nota. Tablero "Resumen General" desarrollado en Power BI para el monitoreo de los indicadores clave de rendimiento.</w:t>
       </w:r>
     </w:p>
     <w:p>
       <w:pPr>
         <w:pStyle w:val="Ttulo2"/>
+        <w:keepNext/>
+        <w:spacing w:before="240" w:after="80"/>
+        <w:jc w:val="left"/>
+      </w:pPr>
+      <w:r>
+        <w:t>Resultado 6. Consultas ejecutivas y asistencia analítica con Inteligencia Artificial</w:t>
+      </w:r>
+    </w:p>
+    <w:p>
+      <w:pPr>
+        <w:spacing w:line="276" w:lineRule="auto" w:after="120" w:before="0"/>
+        <w:jc w:val="both"/>
+      </w:pPr>
+      <w:r>
+        <w:t>Para complementar la visualización gerencial, se integró el módulo Asistente IA (/asistente), basado en Procesamiento de Lenguaje Natural (PLN) y el patrón de invocación de herramientas (Function Calling). Este módulo permite a la administración formular preguntas en lenguaje natural sobre producción, clientes y pesajes, obteniendo respuestas instantáneas basadas en datos reales extraídos de SQL Server sin requerir conocimientos técnicos de SQL.</w:t>
+      </w:r>
+    </w:p>
+    <w:p>
+      <w:pPr>
+        <w:pStyle w:val="Ttulo2"/>
+        <w:keepNext/>
+        <w:spacing w:before="240" w:after="80"/>
+        <w:jc w:val="left"/>
+      </w:pPr>
+      <w:r>
+        <w:t>Síntesis de Resultados e Integración con la Asignatura Proyectos Informáticos</w:t>
+      </w:r>
+    </w:p>
+    <w:p>
+      <w:pPr>
+        <w:spacing w:line="276" w:lineRule="auto" w:after="120" w:before="0"/>
+        <w:jc w:val="both"/>
+      </w:pPr>
+      <w:r>
+        <w:t>Los cuatro indicadores, en su conjunto, demuestran que el sistema automatiza el pesaje (550 operaciones en 60 días), proporciona datos confiables y auditables (98.2 % de éxito con trazabilidad total), es eficiente (2.1 minutos por pesaje) y determina las relaciones comerciales más importantes (Proveedor A S.A. con el 20.2 % del volumen).</w:t>
+      </w:r>
+    </w:p>
+    <w:p>
+      <w:pPr>
+        <w:spacing w:line="276" w:lineRule="auto" w:after="120" w:before="0"/>
+        <w:jc w:val="both"/>
+      </w:pPr>
+      <w:r>
+        <w:t>Proyectos Informáticos, como asignatura que proporciona el marco de gestión para transformar una necesidad de la empresa 'El Troje' en un producto de software planificado, controlado y verificable, constituye el core de este Proyecto Integrador. La integración de la asignatura es metodológica: el contenido de la misma determinó el ciclo de vida del proyecto —desde la Conceptualización y el Análisis de Viabilidad hasta el Cierre y la entrega de la documentación técnica— en función de los grupos de procesos y los dominios de desempeño que establece el Project Management Institute (2021) y de las prácticas de proceso de software que describen Bass et al. (2022).</w:t>
+      </w:r>
+    </w:p>
+    <w:p>
+      <w:pPr>
+        <w:pStyle w:val="Ttulo2"/>
+        <w:keepNext/>
+        <w:spacing w:before="240" w:after="80"/>
+        <w:jc w:val="left"/>
       </w:pPr>
       <w:r>
         <w:t>Estudio de factibilidad del módulo de pesaje y control de vehículos</w:t>
       </w:r>
     </w:p>
     <w:p>
+      <w:pPr>
+        <w:spacing w:line="276" w:lineRule="auto" w:after="120" w:before="0"/>
+        <w:jc w:val="both"/>
+      </w:pPr>
       <w:r>
         <w:t xml:space="preserve">El pesaje de vehículos en los centros de acopio y venta de productos del campo es el primer punto de control físico y económico. En la compañía "El Troje" ubicada en la ciudad de Guayaquil, la cual compra y vende grandes cantidades de productos agrícolas (maíz amarillo duro, soya, arroz, etc.), el proceso de registro y control de peso se lleva a cabo de forma semi-manual en la actualidad. Como resultado, existen muchas ineficiencias; los tiempos de entrega son muy lentos; y existe un gran riesgo de cometer errores al introducir o cambiar los datos de los pesos de entrada y salida de los camiones. La idea es crear un módulo automático de pesaje que sea parte de un sistema web inteligente. Este sistema se conectará directamente a una báscula de camiones industrial Mettler Toledo IND780 mediante una conexión Ethernet TCP/IP. Cuando la báscula esté estable, el sistema capturará el peso neto. Adicionalmente, el sistema registrará cada transacción de manera que no se pueda modificar. No obstante, antes de comenzar a desarrollar el software y a integrar el hardware industrial, es necesario llevar a cabo un estudio de factibilidad (Project Management Institute, 2021). La meta de este estudio de factibilidad es examinar qué tan viable son los aspectos técnicos, operativos y económicos del </w:t>
       </w:r>
@@ -7653,12 +8014,18 @@
       </w:r>
     </w:p>
     <w:p>
+      <w:pPr>
+        <w:spacing w:line="276" w:lineRule="auto" w:after="120" w:before="0"/>
+        <w:jc w:val="both"/>
+      </w:pPr>
       <w:r>
         <w:t>-----------------------</w:t>
       </w:r>
     </w:p>
     <w:p>
       <w:pPr>
+        <w:spacing w:line="276" w:lineRule="auto" w:after="120" w:before="0"/>
+        <w:jc w:val="both"/>
         <w:rPr>
           <w:b/>
         </w:rPr>
@@ -7671,12 +8038,18 @@
       </w:r>
     </w:p>
     <w:p>
+      <w:pPr>
+        <w:spacing w:line="276" w:lineRule="auto" w:after="120" w:before="0"/>
+        <w:jc w:val="both"/>
+      </w:pPr>
       <w:r>
         <w:t>Los aspectos de viabilidad del proyecto de automatización del módulo de pesaje de la empresa "El Troje" se estudian desde tres puntos de vista:</w:t>
       </w:r>
     </w:p>
     <w:p>
       <w:pPr>
+        <w:spacing w:line="276" w:lineRule="auto" w:after="120" w:before="0"/>
+        <w:jc w:val="both"/>
         <w:rPr>
           <w:b/>
         </w:rPr>
@@ -7689,17 +8062,27 @@
       </w:r>
     </w:p>
     <w:p>
+      <w:pPr>
+        <w:spacing w:line="276" w:lineRule="auto" w:after="120" w:before="0"/>
+        <w:jc w:val="both"/>
+      </w:pPr>
       <w:r>
         <w:t xml:space="preserve">Se estudia la viabilidad tecnológica y la infraestructura que se utilizará para desarrollar el software y para su instalación dentro de la infraestructura de la empresa. El objetivo del estudio es comprobar que con los recursos que se tienen actualmente y con los recursos que se van a adquirir, se podrá llevar a cabo la implementación del sistema (International Organization for Standardization, 2023). La evaluación técnica se divide en recursos de software y en recursos de hardware: Los requisitos de software del sistema están explicados en el Anexo S y el diagnóstico de la infraestructura de hardware y conectividad, en el Anexo T. Los casos de uso dinámicos del sistema —diagramas de casos de uso, de secuencia, de actividad y de estados— se muestran en el Anexo W. Competencia del equipo: </w:t>
       </w:r>
     </w:p>
     <w:p>
+      <w:pPr>
+        <w:spacing w:line="276" w:lineRule="auto" w:after="120" w:before="0"/>
+        <w:jc w:val="both"/>
+      </w:pPr>
       <w:r>
         <w:t>La construcción del sistema será realizada por los estudiantes de sexto nivel de la carrera de Ingeniería de Software de la UNIANDES, quienes han demostrado tener las competencias necesarias en C#, arquitectura limpia y bases de datos relacionales. La conexión a través de sockets TCP/IP con tramas Mettler Toledo es posible gracias a que existen manuales del protocolo IND780 y a que se puede contar con el soporte técnico del fabricante. Por lo tanto, el proyecto es viable en el aspecto técnico y no será necesario contratar consultores externos especializados.</w:t>
       </w:r>
     </w:p>
     <w:p>
       <w:pPr>
+        <w:spacing w:line="276" w:lineRule="auto" w:after="120" w:before="0"/>
+        <w:jc w:val="both"/>
         <w:rPr>
           <w:b/>
         </w:rPr>
@@ -7712,6 +8095,10 @@
       </w:r>
     </w:p>
     <w:p>
+      <w:pPr>
+        <w:spacing w:line="276" w:lineRule="auto" w:after="120" w:before="0"/>
+        <w:jc w:val="both"/>
+      </w:pPr>
       <w:r>
         <w:t xml:space="preserve">Se valora la aceptación del nuevo software por los usuarios finales y el nivel de integración de la herramienta web en los procesos operacionales de la empresa (International Organization for Standardization, 2023). Los despachadores y los operadores de báscula de “El Troje” indican tener una actitud positiva hacia la automatización debido al estrés que les </w:t>
       </w:r>
@@ -7730,6 +8117,8 @@
     </w:p>
     <w:p>
       <w:pPr>
+        <w:spacing w:line="276" w:lineRule="auto" w:after="120" w:before="0"/>
+        <w:jc w:val="both"/>
         <w:rPr>
           <w:b/>
         </w:rPr>
@@ -7737,6 +8126,8 @@
     </w:p>
     <w:p>
       <w:pPr>
+        <w:spacing w:line="276" w:lineRule="auto" w:after="120" w:before="0"/>
+        <w:jc w:val="both"/>
         <w:rPr>
           <w:b/>
         </w:rPr>
@@ -7751,8 +8142,10 @@
     <w:p>
       <w:pPr>
         <w:pStyle w:val="Ttulo1"/>
+        <w:keepNext/>
+        <w:spacing w:before="240" w:after="80"/>
         <w:ind w:left="0" w:firstLine="0"/>
-        <w:jc w:val="center"/>
+        <w:jc w:val="left"/>
         <w:rPr>
           <w:b w:val="0"/>
         </w:rPr>
@@ -7767,33 +8160,31 @@
     <w:p>
       <w:pPr>
         <w:pStyle w:val="Ttulo1"/>
+        <w:keepNext/>
+        <w:spacing w:before="240" w:after="80"/>
         <w:ind w:left="0" w:firstLine="0"/>
-        <w:jc w:val="center"/>
+        <w:jc w:val="left"/>
       </w:pPr>
       <w:r>
         <w:t>Conclusiones</w:t>
       </w:r>
     </w:p>
     <w:p>
-      <w:r>
-        <w:t xml:space="preserve">El objetivo principal de construir un sistema web para automatizar el peso y control de vehículos en la báscula de la empresa "El Troje" se logró: el módulo desarrollado automatiza 550 pesos en el período de prueba con un 98.2% de éxito. Además, el módulo incluye una auditoría completa de cada transacción, tal y como se había propuesto. Los resultados de los objetivos secundarios de este proyecto también se cumplen. La interfaz web creada en Angular 19 permite a los usuarios insertar y consultar los pesos con un tiempo promedio de 2.1 minutos por transacción, lo que representa una considerable mejora con respecto a los 8 a 10 minutos que tardaba el proceso manual. El control del peso de los vehículos (incluyendo el peso de </w:t>
-      </w:r>
-      <w:r>
-        <w:lastRenderedPageBreak/>
-        <w:t>entrada y salida) se automatiza por completo gracias a la integración con la báscula a través del socket TCP/IP. De esta manera, se evita la digitación manual. La auditoría integral se implementa a través de la tabla Auditoría, donde se registra el usuario, la fecha, la hora y la dirección IP de cada transacción. Con esto se logra el objetivo de trazabilidad. Finalmente, los reportes de trazabilidad y estadísticas se muestran como los cuatro indicadores clave de rendimiento (ver Anexo O) y en el panel de Power BI (ver Figura 1). Estos indicadores y el panel permiten a la gerencia de la empresa "El Troje" monitorear el volumen de pesajes, la confiabilidad de los datos, el tiempo de operación y las relaciones comerciales más importantes. La factibilidad técnica del módulo de pesaje se demuestra gracias a que se cuenta con licencias de software de código abierto (Angular y .NET), un servidor físico adecuado en la empresa "El Troje" y la factibilidad de interconexión con la balanza Mettler Toledo IND780 a través de un switch y un socket TCP/IP. Además, el equipo de desarrollo tiene los conocimientos necesarios para programar sockets, lo que disminuye el riesgo tecnológico. Desde el punto de vista operativo, el sistema es factible debido a que la interfaz web en Angular es muy fácil de usar. Gracias a esto, el tiempo de registro de un vehículo se reduce de 10 minutos a menos de un minuto. La buena disposición de los operadores (quienes no quieren sufrir estrés operativo ni hacer cálculos manuales) es un factor favorable para la aceptación del sistema y para disminuir la resistencia al cambio. La factibilidad económica está fundamentada en que la inversión inicial es muy baja ($2,200.00 USD). Esto es posible gracias a que se utiliza la infraestructura informática existente y la balanza ya instalada. Se estima que la recuperación de la inversión se logrará en menos de 3 meses de funcionamiento. Esta estimación es realista debido a que el sistema ayudará a disminuir el fraude en los pesajes y a mejorar los flujos de carga. En resumen, el desarrollo e implementación del módulo de pesaje es una opción viable y recomendable desde todos los puntos de vista. Se sugiere al comité de dirección de la empresa que apruebe el inicio de la fase de desarrollo y la compra inmediata de los materiales necesarios para la conectividad.</w:t>
-      </w:r>
-      <w:r>
-        <w:rPr>
-          <w:noProof/>
-        </w:rPr>
-        <w:t xml:space="preserve"> </w:t>
+      <w:pPr>
+        <w:spacing w:line="276" w:lineRule="auto" w:after="120" w:before="0"/>
+        <w:jc w:val="both"/>
+      </w:pPr>
+      <w:r>
+        <w:t xml:space="preserve">El objetivo principal de construir un sistema web para automatizar el peso y control de vehículos en la báscula de la empresa "El Troje" se logró: el módulo desarrollado automatiza 550 pesos en el período de prueba con un 98.2% de éxito. Además, el módulo incluye una auditoría completa de cada transacción, tal y como se había propuesto. Los resultados de los objetivos secundarios de este proyecto también se cumplen. La interfaz web creada en Angular 19 permite a los usuarios insertar y consultar los pesos con un tiempo promedio de 2.1 minutos por transacción, lo que representa una considerable mejora con respecto a los 8 a 10 minutos que tardaba el proceso manual. El control del peso de los vehículos (incluyendo el peso de entrada y salida) se automatiza por completo gracias a la integración con la báscula a través del socket TCP/IP. De esta manera, se evita la digitación manual. La auditoría integral se implementa a través de la tabla Auditoría, donde se registra el usuario, la fecha, la hora y la dirección IP de cada transacción. Con esto se logra el objetivo de trazabilidad. Finalmente, los reportes de trazabilidad y estadísticas se muestran como los cuatro indicadores clave de rendimiento (ver Anexo O) y en el panel de Power BI (ver Resultado 1). Estos indicadores y el panel permiten a la gerencia de la empresa "El Troje" monitorear el volumen de pesajes, la confiabilidad de los datos, el tiempo de operación y las relaciones comerciales más importantes. La factibilidad técnica del módulo de pesaje se demuestra gracias a que se cuenta con licencias de software de código abierto (Angular y .NET), un servidor físico adecuado en la empresa "El Troje" y la factibilidad de interconexión con la balanza Mettler Toledo IND780 a través de un switch y un socket TCP/IP. Además, el equipo de desarrollo tiene los conocimientos necesarios para programar sockets, lo que disminuye el riesgo tecnológico. Desde el punto de vista operativo, el sistema es factible debido a que la interfaz web en Angular es muy fácil de usar. Gracias a esto, el tiempo de registro de un vehículo se reduce de 10 minutos a menos de un minuto. La buena disposición de los operadores (quienes no quieren sufrir estrés operativo ni hacer cálculos manuales) es un factor favorable para la aceptación del sistema y para disminuir la resistencia al cambio. La factibilidad económica está fundamentada en que la inversión inicial es muy baja ($2,200.00 USD). Esto es posible gracias a que se utiliza la infraestructura informática existente y la balanza ya instalada. Se estima que la recuperación de la inversión se logrará en menos de 3 meses de funcionamiento. Esta estimación es realista debido a que el sistema ayudará a disminuir el fraude en los pesajes y a mejorar los flujos de carga. En resumen, el desarrollo e implementación del módulo de pesaje es una opción viable y recomendable desde todos los puntos de vista. Se sugiere al comité de dirección de la empresa que apruebe el inicio de la fase de desarrollo y la compra inmediata de los materiales necesarios para la conectividad. </w:t>
       </w:r>
     </w:p>
     <w:p>
       <w:pPr>
         <w:pStyle w:val="Ttulo1"/>
+        <w:keepNext/>
+        <w:spacing w:before="240" w:after="80"/>
         <w:ind w:left="0" w:firstLine="0"/>
-        <w:jc w:val="center"/>
+        <w:jc w:val="left"/>
       </w:pPr>
       <w:r>
         <w:t>Referencias</w:t>
@@ -7801,6 +8192,8 @@
     </w:p>
     <w:p>
       <w:pPr>
+        <w:spacing w:line="276" w:lineRule="auto" w:after="120" w:before="0"/>
+        <w:jc w:val="both"/>
         <w:rPr>
           <w:lang w:val="en-US"/>
         </w:rPr>
@@ -7820,6 +8213,8 @@
     </w:p>
     <w:p>
       <w:pPr>
+        <w:spacing w:line="276" w:lineRule="auto" w:after="120" w:before="0"/>
+        <w:jc w:val="both"/>
         <w:rPr>
           <w:lang w:val="en-US"/>
         </w:rPr>
@@ -7833,6 +8228,8 @@
     </w:p>
     <w:p>
       <w:pPr>
+        <w:spacing w:line="276" w:lineRule="auto" w:after="120" w:before="0"/>
+        <w:jc w:val="both"/>
         <w:rPr>
           <w:lang w:val="en-US"/>
         </w:rPr>
@@ -7845,6 +8242,10 @@
       </w:r>
     </w:p>
     <w:p>
+      <w:pPr>
+        <w:spacing w:line="276" w:lineRule="auto" w:after="120" w:before="0"/>
+        <w:jc w:val="both"/>
+      </w:pPr>
       <w:r>
         <w:rPr>
           <w:lang w:val="en-US"/>
@@ -7857,6 +8258,8 @@
     </w:p>
     <w:p>
       <w:pPr>
+        <w:spacing w:line="276" w:lineRule="auto" w:after="120" w:before="0"/>
+        <w:jc w:val="both"/>
         <w:rPr>
           <w:lang w:val="en-US"/>
         </w:rPr>
@@ -7874,6 +8277,8 @@
     </w:p>
     <w:p>
       <w:pPr>
+        <w:spacing w:line="276" w:lineRule="auto" w:after="120" w:before="0"/>
+        <w:jc w:val="both"/>
         <w:rPr>
           <w:lang w:val="en-US"/>
         </w:rPr>
@@ -7887,6 +8292,8 @@
     </w:p>
     <w:p>
       <w:pPr>
+        <w:spacing w:line="276" w:lineRule="auto" w:after="120" w:before="0"/>
+        <w:jc w:val="both"/>
         <w:rPr>
           <w:lang w:val="en-US"/>
         </w:rPr>
@@ -7900,6 +8307,8 @@
     </w:p>
     <w:p>
       <w:pPr>
+        <w:spacing w:line="276" w:lineRule="auto" w:after="120" w:before="0"/>
+        <w:jc w:val="both"/>
         <w:rPr>
           <w:lang w:val="en-US"/>
         </w:rPr>
@@ -7919,6 +8328,8 @@
     </w:p>
     <w:p>
       <w:pPr>
+        <w:spacing w:line="276" w:lineRule="auto" w:after="120" w:before="0"/>
+        <w:jc w:val="both"/>
         <w:rPr>
           <w:lang w:val="en-US"/>
         </w:rPr>
@@ -7932,6 +8343,8 @@
     </w:p>
     <w:p>
       <w:pPr>
+        <w:spacing w:line="276" w:lineRule="auto" w:after="120" w:before="0"/>
+        <w:jc w:val="both"/>
         <w:rPr>
           <w:lang w:val="en-US"/>
         </w:rPr>
@@ -7951,6 +8364,8 @@
     </w:p>
     <w:p>
       <w:pPr>
+        <w:spacing w:line="276" w:lineRule="auto" w:after="120" w:before="0"/>
+        <w:jc w:val="both"/>
         <w:rPr>
           <w:lang w:val="en-US"/>
         </w:rPr>
@@ -7967,6 +8382,8 @@
     </w:p>
     <w:p>
       <w:pPr>
+        <w:spacing w:line="276" w:lineRule="auto" w:after="120" w:before="0"/>
+        <w:jc w:val="both"/>
         <w:rPr>
           <w:lang w:val="en-US"/>
         </w:rPr>
@@ -7979,6 +8396,10 @@
       </w:r>
     </w:p>
     <w:p>
+      <w:pPr>
+        <w:spacing w:line="276" w:lineRule="auto" w:after="120" w:before="0"/>
+        <w:jc w:val="both"/>
+      </w:pPr>
       <w:r>
         <w:rPr>
           <w:lang w:val="en-US"/>
@@ -7991,6 +8412,8 @@
     </w:p>
     <w:p>
       <w:pPr>
+        <w:spacing w:line="276" w:lineRule="auto" w:after="120" w:before="0"/>
+        <w:jc w:val="both"/>
         <w:rPr>
           <w:lang w:val="en-US"/>
         </w:rPr>
@@ -8007,6 +8430,8 @@
     </w:p>
     <w:p>
       <w:pPr>
+        <w:spacing w:line="276" w:lineRule="auto" w:after="120" w:before="0"/>
+        <w:jc w:val="both"/>
         <w:rPr>
           <w:lang w:val="en-US"/>
         </w:rPr>
@@ -8020,6 +8445,8 @@
     </w:p>
     <w:p>
       <w:pPr>
+        <w:spacing w:line="276" w:lineRule="auto" w:after="120" w:before="0"/>
+        <w:jc w:val="both"/>
         <w:rPr>
           <w:lang w:val="en-US"/>
         </w:rPr>
@@ -8032,6 +8459,10 @@
       </w:r>
     </w:p>
     <w:p>
+      <w:pPr>
+        <w:spacing w:line="276" w:lineRule="auto" w:after="120" w:before="0"/>
+        <w:jc w:val="both"/>
+      </w:pPr>
       <w:r>
         <w:rPr>
           <w:lang w:val="en-US"/>
@@ -8043,12 +8474,18 @@
       </w:r>
     </w:p>
     <w:p>
+      <w:pPr>
+        <w:spacing w:line="276" w:lineRule="auto" w:after="120" w:before="0"/>
+        <w:jc w:val="both"/>
+      </w:pPr>
       <w:r>
         <w:t>Schwaber, K., &amp; Sutherland, J. (2020). La guía de Scrum: Las reglas del juego. Scrum.org.</w:t>
       </w:r>
     </w:p>
     <w:p>
       <w:pPr>
+        <w:spacing w:line="276" w:lineRule="auto" w:after="120" w:before="0"/>
+        <w:jc w:val="both"/>
         <w:rPr>
           <w:b/>
         </w:rPr>
@@ -8061,6 +8498,10 @@
       </w:r>
     </w:p>
     <w:p>
+      <w:pPr>
+        <w:spacing w:line="276" w:lineRule="auto" w:after="120" w:before="0"/>
+        <w:jc w:val="both"/>
+      </w:pPr>
       <w:r>
         <w:lastRenderedPageBreak/>
         <w:t>Anexo A. Cuestionario para el levantamiento de requerimientos del módulo de pesaje aplicado a las 8 personas vinculadas al proceso</w:t>
@@ -8070,61 +8511,109 @@
       </w:r>
     </w:p>
     <w:p>
+      <w:pPr>
+        <w:spacing w:line="276" w:lineRule="auto" w:after="120" w:before="0"/>
+        <w:jc w:val="both"/>
+      </w:pPr>
       <w:r>
         <w:t>Anexo B. Estructura de desglose del trabajo (EDT) y cronograma de sprints del Proyecto Integrador, elaborados en la asignatura Proyectos Informáticos.</w:t>
       </w:r>
     </w:p>
     <w:p>
+      <w:pPr>
+        <w:spacing w:line="276" w:lineRule="auto" w:after="120" w:before="0"/>
+        <w:jc w:val="both"/>
+      </w:pPr>
       <w:r>
         <w:t>Anexo C. Manual técnico, manual de usuario y acta de entrega del módulo de pesaje.</w:t>
       </w:r>
     </w:p>
     <w:p>
+      <w:pPr>
+        <w:spacing w:line="276" w:lineRule="auto" w:after="120" w:before="0"/>
+        <w:jc w:val="both"/>
+      </w:pPr>
       <w:r>
         <w:t>Anexo D. Fichas de registro de tiempos e incidencias de las 550 operaciones de pesaje que integran la muestra.</w:t>
       </w:r>
     </w:p>
     <w:p>
+      <w:pPr>
+        <w:spacing w:line="276" w:lineRule="auto" w:after="120" w:before="0"/>
+        <w:jc w:val="both"/>
+      </w:pPr>
       <w:r>
         <w:t>Anexo E. Capturas de los tableros de Power BI con el detalle de los cuatro indicadores clave de rendimiento.</w:t>
       </w:r>
     </w:p>
     <w:p>
+      <w:pPr>
+        <w:spacing w:line="276" w:lineRule="auto" w:after="120" w:before="0"/>
+        <w:jc w:val="both"/>
+      </w:pPr>
       <w:r>
         <w:t>Anexo G. Cronograma de actividades del Proyecto Integrador.</w:t>
       </w:r>
     </w:p>
     <w:p>
+      <w:pPr>
+        <w:spacing w:line="276" w:lineRule="auto" w:after="120" w:before="0"/>
+        <w:jc w:val="both"/>
+      </w:pPr>
       <w:r>
         <w:t>Anexo H. Información general de costos de la tarea.</w:t>
       </w:r>
     </w:p>
     <w:p>
+      <w:pPr>
+        <w:spacing w:line="276" w:lineRule="auto" w:after="120" w:before="0"/>
+        <w:jc w:val="both"/>
+      </w:pPr>
       <w:r>
         <w:t>Anexo I. Capturas del funcionamiento del sistema.</w:t>
       </w:r>
     </w:p>
     <w:p>
+      <w:pPr>
+        <w:spacing w:line="276" w:lineRule="auto" w:after="120" w:before="0"/>
+        <w:jc w:val="both"/>
+      </w:pPr>
       <w:r>
         <w:t>Anexo J. Identificación de riesgos y plan de contingencia.</w:t>
       </w:r>
     </w:p>
     <w:p>
+      <w:pPr>
+        <w:spacing w:line="276" w:lineRule="auto" w:after="120" w:before="0"/>
+        <w:jc w:val="both"/>
+      </w:pPr>
       <w:r>
         <w:t>Anexo L. Arquitectura de cinco capas del sistema.</w:t>
       </w:r>
     </w:p>
     <w:p>
+      <w:pPr>
+        <w:spacing w:line="276" w:lineRule="auto" w:after="120" w:before="0"/>
+        <w:jc w:val="both"/>
+      </w:pPr>
       <w:r>
         <w:t>Anexo M. Técnicas e instrumentos de recolección de datos.</w:t>
       </w:r>
     </w:p>
     <w:p>
+      <w:pPr>
+        <w:spacing w:line="276" w:lineRule="auto" w:after="120" w:before="0"/>
+        <w:jc w:val="both"/>
+      </w:pPr>
       <w:r>
         <w:t>Anexo N. Composición de la población y la muestra del estudio.</w:t>
       </w:r>
     </w:p>
     <w:p>
+      <w:pPr>
+        <w:spacing w:line="276" w:lineRule="auto" w:after="120" w:before="0"/>
+        <w:jc w:val="both"/>
+      </w:pPr>
       <w:r>
         <w:t>Anexo O. Indicadores clave de rendimiento del módulo de pesaje.</w:t>
       </w:r>
@@ -8136,21 +8625,37 @@
       </w:r>
     </w:p>
     <w:p>
+      <w:pPr>
+        <w:spacing w:line="276" w:lineRule="auto" w:after="120" w:before="0"/>
+        <w:jc w:val="both"/>
+      </w:pPr>
       <w:r>
         <w:t>Anexo P. Resumen de los indicadores clave de rendimiento medidos.</w:t>
       </w:r>
     </w:p>
     <w:p>
+      <w:pPr>
+        <w:spacing w:line="276" w:lineRule="auto" w:after="120" w:before="0"/>
+        <w:jc w:val="both"/>
+      </w:pPr>
       <w:r>
         <w:t>Anexo Q. Integración de los contenidos de la asignatura Proyectos Informáticos al Proyecto Integrador.</w:t>
       </w:r>
     </w:p>
     <w:p>
+      <w:pPr>
+        <w:spacing w:line="276" w:lineRule="auto" w:after="120" w:before="0"/>
+        <w:jc w:val="both"/>
+      </w:pPr>
       <w:r>
         <w:t>Anexo R. Integración horizontal de las asignaturas del nivel al Proyecto Integrador.</w:t>
       </w:r>
     </w:p>
     <w:p>
+      <w:pPr>
+        <w:spacing w:line="276" w:lineRule="auto" w:after="120" w:before="0"/>
+        <w:jc w:val="both"/>
+      </w:pPr>
       <w:r>
         <w:t>Anexo S. Requerimientos de software del sistema de pesaje.</w:t>
       </w:r>
@@ -8162,26 +8667,45 @@
       </w:r>
     </w:p>
     <w:p>
+      <w:pPr>
+        <w:spacing w:line="276" w:lineRule="auto" w:after="120" w:before="0"/>
+        <w:jc w:val="both"/>
+      </w:pPr>
       <w:r>
         <w:t>Anexo T. Diagnóstico de la infraestructura de hardware y conectividad.</w:t>
       </w:r>
     </w:p>
     <w:p>
+      <w:pPr>
+        <w:spacing w:line="276" w:lineRule="auto" w:after="120" w:before="0"/>
+        <w:jc w:val="both"/>
+      </w:pPr>
       <w:r>
         <w:t>Anexo U. Análisis de costos de desarrollo e implementación.</w:t>
       </w:r>
     </w:p>
     <w:p>
+      <w:pPr>
+        <w:spacing w:line="276" w:lineRule="auto" w:after="120" w:before="0"/>
+        <w:jc w:val="both"/>
+      </w:pPr>
       <w:r>
         <w:t>Anexo W. Casos de usos dinámicos del sistema de pesaje.</w:t>
       </w:r>
     </w:p>
-    <w:p/>
+    <w:p>
+      <w:pPr>
+        <w:spacing w:line="276" w:lineRule="auto" w:after="120" w:before="0"/>
+        <w:jc w:val="both"/>
+      </w:pPr>
+    </w:p>
     <w:p>
       <w:pPr>
         <w:pStyle w:val="Ttulo1"/>
-        <w:spacing w:after="0"/>
+        <w:keepNext/>
+        <w:spacing w:after="80" w:before="240"/>
         <w:ind w:left="363"/>
+        <w:jc w:val="left"/>
         <w:sectPr>
           <w:headerReference w:type="even" r:id="rId13"/>
           <w:headerReference w:type="default" r:id="rId14"/>
@@ -8200,19 +8724,27 @@
     <w:p>
       <w:pPr>
         <w:pStyle w:val="Ttulo1"/>
-        <w:spacing w:after="0"/>
+        <w:keepNext/>
+        <w:spacing w:after="80" w:before="240"/>
         <w:ind w:left="363"/>
+        <w:jc w:val="left"/>
       </w:pPr>
       <w:r>
         <w:lastRenderedPageBreak/>
         <w:t xml:space="preserve">ANEXO G. CRONOGRAMA DE ACTIVIDADES </w:t>
       </w:r>
     </w:p>
-    <w:p/>
-    <w:p>
-      <w:pPr>
-        <w:spacing w:after="0" w:line="238" w:lineRule="auto"/>
+    <w:p>
+      <w:pPr>
+        <w:spacing w:line="276" w:lineRule="auto" w:after="120" w:before="0"/>
+        <w:jc w:val="both"/>
+      </w:pPr>
+    </w:p>
+    <w:p>
+      <w:pPr>
+        <w:spacing w:after="120" w:line="276" w:lineRule="auto" w:before="0"/>
         <w:ind w:right="35" w:firstLine="0"/>
+        <w:jc w:val="both"/>
       </w:pPr>
       <w:r>
         <w:t xml:space="preserve">El presente cronograma organiza las actividades del Proyecto Integrador en función del método ágil SCRUM, en el cual las sprint tienen una duración de dos semanas (ver Metodología). El Proyecto Integrador comenzará el día 11 de mayo de 2026 y finalizará con la defensa </w:t>
@@ -8228,8 +8760,9 @@
     </w:p>
     <w:p>
       <w:pPr>
-        <w:spacing w:after="0" w:line="238" w:lineRule="auto"/>
+        <w:spacing w:after="120" w:line="276" w:lineRule="auto" w:before="0"/>
         <w:ind w:right="35" w:firstLine="0"/>
+        <w:jc w:val="both"/>
       </w:pPr>
       <w:r>
         <w:rPr>
@@ -8294,9 +8827,9 @@
     </w:p>
     <w:p>
       <w:pPr>
-        <w:spacing w:after="0" w:line="259" w:lineRule="auto"/>
+        <w:spacing w:after="120" w:line="276" w:lineRule="auto" w:before="0"/>
         <w:ind w:right="249" w:firstLine="0"/>
-        <w:jc w:val="right"/>
+        <w:jc w:val="both"/>
       </w:pPr>
       <w:r>
         <w:rPr>
@@ -8370,8 +8903,9 @@
     </w:p>
     <w:p>
       <w:pPr>
-        <w:spacing w:after="0" w:line="259" w:lineRule="auto"/>
+        <w:spacing w:after="120" w:line="276" w:lineRule="auto" w:before="0"/>
         <w:ind w:left="433" w:firstLine="0"/>
+        <w:jc w:val="both"/>
       </w:pPr>
       <w:r>
         <w:lastRenderedPageBreak/>
@@ -8420,8 +8954,9 @@
     </w:p>
     <w:p>
       <w:pPr>
-        <w:spacing w:after="0" w:line="259" w:lineRule="auto"/>
+        <w:spacing w:after="120" w:line="276" w:lineRule="auto" w:before="0"/>
         <w:ind w:left="433" w:firstLine="0"/>
+        <w:jc w:val="both"/>
       </w:pPr>
       <w:r>
         <w:rPr>
@@ -8467,8 +9002,9 @@
     </w:p>
     <w:p>
       <w:pPr>
-        <w:spacing w:after="0" w:line="259" w:lineRule="auto"/>
+        <w:spacing w:after="120" w:line="276" w:lineRule="auto" w:before="0"/>
         <w:ind w:left="433" w:firstLine="0"/>
+        <w:jc w:val="both"/>
       </w:pPr>
       <w:r>
         <w:rPr>
@@ -8514,8 +9050,9 @@
     </w:p>
     <w:p>
       <w:pPr>
-        <w:spacing w:after="0" w:line="259" w:lineRule="auto"/>
+        <w:spacing w:after="120" w:line="276" w:lineRule="auto" w:before="0"/>
         <w:ind w:left="433" w:firstLine="0"/>
+        <w:jc w:val="both"/>
       </w:pPr>
       <w:r>
         <w:rPr>
@@ -8562,6 +9099,9 @@
     <w:p>
       <w:pPr>
         <w:pStyle w:val="Ttulo1"/>
+        <w:keepNext/>
+        <w:spacing w:before="240" w:after="80"/>
+        <w:jc w:val="left"/>
         <w:sectPr>
           <w:pgSz w:w="16840" w:h="11912" w:orient="landscape"/>
           <w:pgMar w:top="1100" w:right="1088" w:bottom="1560" w:left="1000" w:header="720" w:footer="720" w:gutter="0"/>
@@ -8573,6 +9113,9 @@
     <w:p>
       <w:pPr>
         <w:pStyle w:val="Ttulo1"/>
+        <w:keepNext/>
+        <w:spacing w:before="240" w:after="80"/>
+        <w:jc w:val="left"/>
       </w:pPr>
       <w:r>
         <w:lastRenderedPageBreak/>
@@ -8581,8 +9124,9 @@
     </w:p>
     <w:p>
       <w:pPr>
-        <w:spacing w:after="0"/>
+        <w:spacing w:after="120" w:line="276" w:lineRule="auto" w:before="0"/>
         <w:ind w:firstLine="0"/>
+        <w:jc w:val="both"/>
       </w:pPr>
       <w:r>
         <w:t xml:space="preserve">Este anexo presenta el informe de los costes que han sido elaborados a partir del horario del proyecto de Microsoft Project. El mencionado informe contiene el coste de cada una de las fases (la fase de planificación inicial, los sprints de desarrollo (un total de siete), la fase de prueba de los usuarios, la documentación de cierre y la defensa) y la desglose de </w:t>
@@ -8598,8 +9142,9 @@
     </w:p>
     <w:p>
       <w:pPr>
-        <w:spacing w:after="0"/>
+        <w:spacing w:after="120" w:line="276" w:lineRule="auto" w:before="0"/>
         <w:ind w:firstLine="0"/>
+        <w:jc w:val="both"/>
         <w:rPr>
           <w:b/>
         </w:rPr>
@@ -8613,8 +9158,9 @@
     </w:p>
     <w:p>
       <w:pPr>
-        <w:spacing w:after="0"/>
+        <w:spacing w:after="120" w:line="276" w:lineRule="auto" w:before="0"/>
         <w:ind w:firstLine="0"/>
+        <w:jc w:val="both"/>
         <w:rPr>
           <w:i/>
         </w:rPr>
@@ -8686,13 +9232,15 @@
     </w:p>
     <w:p>
       <w:pPr>
-        <w:jc w:val="center"/>
-      </w:pPr>
-    </w:p>
-    <w:p>
-      <w:pPr>
-        <w:spacing w:after="160" w:line="259" w:lineRule="auto"/>
+        <w:spacing w:line="276" w:lineRule="auto" w:after="120" w:before="0"/>
+        <w:jc w:val="both"/>
+      </w:pPr>
+    </w:p>
+    <w:p>
+      <w:pPr>
+        <w:spacing w:after="120" w:line="276" w:lineRule="auto" w:before="0"/>
         <w:ind w:firstLine="0"/>
+        <w:jc w:val="both"/>
       </w:pPr>
       <w:r>
         <w:rPr>
@@ -8707,8 +9255,9 @@
     </w:p>
     <w:p>
       <w:pPr>
-        <w:spacing w:after="160" w:line="259" w:lineRule="auto"/>
+        <w:spacing w:after="120" w:line="276" w:lineRule="auto" w:before="0"/>
         <w:ind w:firstLine="708"/>
+        <w:jc w:val="both"/>
         <w:rPr>
           <w:sz w:val="20"/>
         </w:rPr>
@@ -8728,6 +9277,9 @@
     <w:p>
       <w:pPr>
         <w:pStyle w:val="Ttulo1"/>
+        <w:keepNext/>
+        <w:spacing w:before="240" w:after="80"/>
+        <w:jc w:val="left"/>
       </w:pPr>
       <w:r>
         <w:t>Inicio de sesión</w:t>
@@ -8735,8 +9287,9 @@
     </w:p>
     <w:p>
       <w:pPr>
-        <w:spacing w:after="0"/>
+        <w:spacing w:after="120" w:line="276" w:lineRule="auto" w:before="0"/>
         <w:ind w:firstLine="0"/>
+        <w:jc w:val="both"/>
         <w:rPr>
           <w:b/>
         </w:rPr>
@@ -8750,8 +9303,9 @@
     </w:p>
     <w:p>
       <w:pPr>
-        <w:spacing w:after="0"/>
+        <w:spacing w:after="120" w:line="276" w:lineRule="auto" w:before="0"/>
         <w:ind w:firstLine="0"/>
+        <w:jc w:val="both"/>
         <w:rPr>
           <w:i/>
         </w:rPr>
@@ -8765,7 +9319,8 @@
     </w:p>
     <w:p>
       <w:pPr>
-        <w:jc w:val="center"/>
+        <w:spacing w:line="276" w:lineRule="auto" w:after="120" w:before="0"/>
+        <w:jc w:val="both"/>
         <w:rPr>
           <w:sz w:val="20"/>
         </w:rPr>
@@ -8821,6 +9376,9 @@
     <w:p>
       <w:pPr>
         <w:pStyle w:val="Ttulo1"/>
+        <w:keepNext/>
+        <w:spacing w:before="240" w:after="80"/>
+        <w:jc w:val="left"/>
       </w:pPr>
       <w:r>
         <w:rPr>
@@ -8841,8 +9399,9 @@
     </w:p>
     <w:p>
       <w:pPr>
-        <w:spacing w:after="0"/>
+        <w:spacing w:after="120" w:line="276" w:lineRule="auto" w:before="0"/>
         <w:ind w:firstLine="0"/>
+        <w:jc w:val="both"/>
         <w:rPr>
           <w:b/>
         </w:rPr>
@@ -8856,8 +9415,9 @@
     </w:p>
     <w:p>
       <w:pPr>
-        <w:spacing w:after="0"/>
+        <w:spacing w:after="120" w:line="276" w:lineRule="auto" w:before="0"/>
         <w:ind w:firstLine="0"/>
+        <w:jc w:val="both"/>
         <w:rPr>
           <w:i/>
         </w:rPr>
@@ -8933,7 +9493,8 @@
     </w:p>
     <w:p>
       <w:pPr>
-        <w:jc w:val="center"/>
+        <w:spacing w:line="276" w:lineRule="auto" w:after="120" w:before="0"/>
+        <w:jc w:val="both"/>
         <w:rPr>
           <w:sz w:val="20"/>
         </w:rPr>
@@ -8942,7 +9503,10 @@
     <w:p>
       <w:pPr>
         <w:pStyle w:val="Ttulo1"/>
+        <w:keepNext/>
+        <w:spacing w:before="240" w:after="80"/>
         <w:ind w:firstLine="0"/>
+        <w:jc w:val="left"/>
       </w:pPr>
       <w:r>
         <w:br w:type="page"/>
@@ -8954,8 +9518,9 @@
     </w:p>
     <w:p>
       <w:pPr>
-        <w:spacing w:after="0"/>
+        <w:spacing w:after="120" w:line="276" w:lineRule="auto" w:before="0"/>
         <w:ind w:firstLine="0"/>
+        <w:jc w:val="both"/>
         <w:rPr>
           <w:b/>
         </w:rPr>
@@ -8969,8 +9534,9 @@
     </w:p>
     <w:p>
       <w:pPr>
-        <w:spacing w:after="0"/>
+        <w:spacing w:after="120" w:line="276" w:lineRule="auto" w:before="0"/>
         <w:ind w:firstLine="0"/>
+        <w:jc w:val="both"/>
         <w:rPr>
           <w:i/>
         </w:rPr>
@@ -9046,7 +9612,8 @@
     </w:p>
     <w:p>
       <w:pPr>
-        <w:jc w:val="center"/>
+        <w:spacing w:line="276" w:lineRule="auto" w:after="120" w:before="0"/>
+        <w:jc w:val="both"/>
         <w:rPr>
           <w:sz w:val="20"/>
         </w:rPr>
@@ -9055,7 +9622,10 @@
     <w:p>
       <w:pPr>
         <w:pStyle w:val="Ttulo1"/>
+        <w:keepNext/>
+        <w:spacing w:before="240" w:after="80"/>
         <w:ind w:firstLine="0"/>
+        <w:jc w:val="left"/>
       </w:pPr>
       <w:r>
         <w:br w:type="page"/>
@@ -9067,8 +9637,9 @@
     </w:p>
     <w:p>
       <w:pPr>
-        <w:spacing w:after="0"/>
+        <w:spacing w:after="120" w:line="276" w:lineRule="auto" w:before="0"/>
         <w:ind w:firstLine="0"/>
+        <w:jc w:val="both"/>
         <w:rPr>
           <w:b/>
         </w:rPr>
@@ -9082,8 +9653,9 @@
     </w:p>
     <w:p>
       <w:pPr>
-        <w:spacing w:after="0"/>
+        <w:spacing w:after="120" w:line="276" w:lineRule="auto" w:before="0"/>
         <w:ind w:firstLine="0"/>
+        <w:jc w:val="both"/>
         <w:rPr>
           <w:i/>
         </w:rPr>
@@ -9097,7 +9669,8 @@
     </w:p>
     <w:p>
       <w:pPr>
-        <w:jc w:val="center"/>
+        <w:spacing w:line="276" w:lineRule="auto" w:after="120" w:before="0"/>
+        <w:jc w:val="both"/>
         <w:rPr>
           <w:sz w:val="20"/>
         </w:rPr>
@@ -9153,11 +9726,17 @@
     <w:p>
       <w:pPr>
         <w:pStyle w:val="Ttulo1"/>
+        <w:keepNext/>
+        <w:spacing w:before="240" w:after="80"/>
+        <w:jc w:val="left"/>
       </w:pPr>
     </w:p>
     <w:p>
       <w:pPr>
         <w:pStyle w:val="Ttulo1"/>
+        <w:keepNext/>
+        <w:spacing w:before="240" w:after="80"/>
+        <w:jc w:val="left"/>
       </w:pPr>
       <w:proofErr w:type="gramStart"/>
       <w:r>
@@ -9167,8 +9746,9 @@
     </w:p>
     <w:p>
       <w:pPr>
-        <w:spacing w:after="0"/>
+        <w:spacing w:after="120" w:line="276" w:lineRule="auto" w:before="0"/>
         <w:ind w:firstLine="0"/>
+        <w:jc w:val="both"/>
         <w:rPr>
           <w:b/>
         </w:rPr>
@@ -9182,8 +9762,9 @@
     </w:p>
     <w:p>
       <w:pPr>
-        <w:spacing w:after="0"/>
+        <w:spacing w:after="120" w:line="276" w:lineRule="auto" w:before="0"/>
         <w:ind w:firstLine="0"/>
+        <w:jc w:val="both"/>
         <w:rPr>
           <w:i/>
         </w:rPr>
@@ -9211,7 +9792,8 @@
     </w:p>
     <w:p>
       <w:pPr>
-        <w:jc w:val="center"/>
+        <w:spacing w:line="276" w:lineRule="auto" w:after="120" w:before="0"/>
+        <w:jc w:val="both"/>
         <w:rPr>
           <w:sz w:val="20"/>
         </w:rPr>
@@ -9267,7 +9849,10 @@
     <w:p>
       <w:pPr>
         <w:pStyle w:val="Ttulo1"/>
+        <w:keepNext/>
+        <w:spacing w:before="240" w:after="80"/>
         <w:ind w:firstLine="0"/>
+        <w:jc w:val="left"/>
       </w:pPr>
       <w:r>
         <w:br w:type="page"/>
@@ -9279,8 +9864,9 @@
     </w:p>
     <w:p>
       <w:pPr>
-        <w:spacing w:after="0"/>
+        <w:spacing w:after="120" w:line="276" w:lineRule="auto" w:before="0"/>
         <w:ind w:firstLine="0"/>
+        <w:jc w:val="both"/>
         <w:rPr>
           <w:b/>
         </w:rPr>
@@ -9294,8 +9880,9 @@
     </w:p>
     <w:p>
       <w:pPr>
-        <w:spacing w:after="0"/>
+        <w:spacing w:after="120" w:line="276" w:lineRule="auto" w:before="0"/>
         <w:ind w:firstLine="0"/>
+        <w:jc w:val="both"/>
         <w:rPr>
           <w:i/>
         </w:rPr>
@@ -9371,7 +9958,8 @@
     </w:p>
     <w:p>
       <w:pPr>
-        <w:jc w:val="center"/>
+        <w:spacing w:line="276" w:lineRule="auto" w:after="120" w:before="0"/>
+        <w:jc w:val="both"/>
         <w:rPr>
           <w:sz w:val="20"/>
         </w:rPr>
@@ -9380,7 +9968,10 @@
     <w:p>
       <w:pPr>
         <w:pStyle w:val="Ttulo1"/>
+        <w:keepNext/>
+        <w:spacing w:before="240" w:after="80"/>
         <w:ind w:firstLine="0"/>
+        <w:jc w:val="left"/>
       </w:pPr>
       <w:r>
         <w:br w:type="page"/>
@@ -9392,8 +9983,9 @@
     </w:p>
     <w:p>
       <w:pPr>
-        <w:spacing w:after="0"/>
+        <w:spacing w:after="120" w:line="276" w:lineRule="auto" w:before="0"/>
         <w:ind w:firstLine="0"/>
+        <w:jc w:val="both"/>
         <w:rPr>
           <w:b/>
         </w:rPr>
@@ -9407,8 +9999,9 @@
     </w:p>
     <w:p>
       <w:pPr>
-        <w:spacing w:after="0"/>
+        <w:spacing w:after="120" w:line="276" w:lineRule="auto" w:before="0"/>
         <w:ind w:firstLine="0"/>
+        <w:jc w:val="both"/>
         <w:rPr>
           <w:i/>
         </w:rPr>
@@ -9484,7 +10077,8 @@
     </w:p>
     <w:p>
       <w:pPr>
-        <w:jc w:val="center"/>
+        <w:spacing w:line="276" w:lineRule="auto" w:after="120" w:before="0"/>
+        <w:jc w:val="both"/>
         <w:rPr>
           <w:sz w:val="20"/>
         </w:rPr>
@@ -9493,7 +10087,10 @@
     <w:p>
       <w:pPr>
         <w:pStyle w:val="Ttulo1"/>
+        <w:keepNext/>
+        <w:spacing w:before="240" w:after="80"/>
         <w:ind w:firstLine="0"/>
+        <w:jc w:val="left"/>
       </w:pPr>
       <w:r>
         <w:br w:type="page"/>
@@ -9505,8 +10102,9 @@
     </w:p>
     <w:p>
       <w:pPr>
-        <w:spacing w:after="0"/>
+        <w:spacing w:after="120" w:line="276" w:lineRule="auto" w:before="0"/>
         <w:ind w:firstLine="0"/>
+        <w:jc w:val="both"/>
         <w:rPr>
           <w:b/>
         </w:rPr>
@@ -9520,8 +10118,9 @@
     </w:p>
     <w:p>
       <w:pPr>
-        <w:spacing w:after="0"/>
+        <w:spacing w:after="120" w:line="276" w:lineRule="auto" w:before="0"/>
         <w:ind w:firstLine="0"/>
+        <w:jc w:val="both"/>
         <w:rPr>
           <w:i/>
         </w:rPr>
@@ -9535,7 +10134,8 @@
     </w:p>
     <w:p>
       <w:pPr>
-        <w:jc w:val="center"/>
+        <w:spacing w:line="276" w:lineRule="auto" w:after="120" w:before="0"/>
+        <w:jc w:val="both"/>
         <w:rPr>
           <w:sz w:val="20"/>
         </w:rPr>
@@ -9591,7 +10191,10 @@
     <w:p>
       <w:pPr>
         <w:pStyle w:val="Ttulo1"/>
+        <w:keepNext/>
+        <w:spacing w:before="240" w:after="80"/>
         <w:ind w:firstLine="0"/>
+        <w:jc w:val="left"/>
       </w:pPr>
       <w:r>
         <w:br w:type="page"/>
@@ -9603,8 +10206,9 @@
     </w:p>
     <w:p>
       <w:pPr>
-        <w:spacing w:after="0"/>
+        <w:spacing w:after="120" w:line="276" w:lineRule="auto" w:before="0"/>
         <w:ind w:firstLine="0"/>
+        <w:jc w:val="both"/>
         <w:rPr>
           <w:b/>
         </w:rPr>
@@ -9618,8 +10222,9 @@
     </w:p>
     <w:p>
       <w:pPr>
-        <w:spacing w:after="0"/>
+        <w:spacing w:after="120" w:line="276" w:lineRule="auto" w:before="0"/>
         <w:ind w:firstLine="0"/>
+        <w:jc w:val="both"/>
         <w:rPr>
           <w:i/>
         </w:rPr>
@@ -9640,7 +10245,8 @@
     </w:p>
     <w:p>
       <w:pPr>
-        <w:jc w:val="center"/>
+        <w:spacing w:line="276" w:lineRule="auto" w:after="120" w:before="0"/>
+        <w:jc w:val="both"/>
         <w:rPr>
           <w:sz w:val="20"/>
         </w:rPr>
@@ -9696,7 +10302,10 @@
     <w:p>
       <w:pPr>
         <w:pStyle w:val="Ttulo1"/>
+        <w:keepNext/>
+        <w:spacing w:before="240" w:after="80"/>
         <w:ind w:firstLine="0"/>
+        <w:jc w:val="left"/>
       </w:pPr>
       <w:r>
         <w:br w:type="page"/>
@@ -9708,8 +10317,9 @@
     </w:p>
     <w:p>
       <w:pPr>
-        <w:spacing w:after="0"/>
+        <w:spacing w:after="120" w:line="276" w:lineRule="auto" w:before="0"/>
         <w:ind w:firstLine="0"/>
+        <w:jc w:val="both"/>
         <w:rPr>
           <w:b/>
         </w:rPr>
@@ -9723,8 +10333,9 @@
     </w:p>
     <w:p>
       <w:pPr>
-        <w:spacing w:after="0"/>
+        <w:spacing w:after="120" w:line="276" w:lineRule="auto" w:before="0"/>
         <w:ind w:firstLine="0"/>
+        <w:jc w:val="both"/>
         <w:rPr>
           <w:i/>
         </w:rPr>
@@ -9738,7 +10349,8 @@
     </w:p>
     <w:p>
       <w:pPr>
-        <w:jc w:val="center"/>
+        <w:spacing w:line="276" w:lineRule="auto" w:after="120" w:before="0"/>
+        <w:jc w:val="both"/>
         <w:rPr>
           <w:sz w:val="20"/>
         </w:rPr>
@@ -9793,8 +10405,9 @@
     </w:p>
     <w:p>
       <w:pPr>
-        <w:spacing w:after="160" w:line="259" w:lineRule="auto"/>
+        <w:spacing w:after="120" w:line="276" w:lineRule="auto" w:before="0"/>
         <w:ind w:firstLine="0"/>
+        <w:jc w:val="both"/>
       </w:pPr>
       <w:r>
         <w:rPr>
@@ -9808,6 +10421,10 @@
       </w:r>
     </w:p>
     <w:p>
+      <w:pPr>
+        <w:spacing w:line="276" w:lineRule="auto" w:after="120" w:before="0"/>
+        <w:jc w:val="both"/>
+      </w:pPr>
       <w:r>
         <w:t xml:space="preserve">Teniendo en cuenta los estándares de gestión de riesgos del Project Management Institute (2021) que se presentan en la </w:t>
       </w:r>
@@ -9823,6 +10440,9 @@
     <w:p>
       <w:pPr>
         <w:pStyle w:val="Ttulo2"/>
+        <w:keepNext/>
+        <w:spacing w:before="240" w:after="80"/>
+        <w:jc w:val="left"/>
         <w:rPr>
           <w:b w:val="0"/>
         </w:rPr>
@@ -9832,6 +10452,10 @@
       </w:r>
     </w:p>
     <w:p>
+      <w:pPr>
+        <w:spacing w:line="276" w:lineRule="auto" w:after="120" w:before="0"/>
+        <w:jc w:val="both"/>
+      </w:pPr>
       <w:r>
         <w:t>En la Tabla 1 se listan</w:t>
       </w:r>
@@ -9841,7 +10465,9 @@
     </w:p>
     <w:p>
       <w:pPr>
+        <w:spacing w:line="276" w:lineRule="auto" w:after="120" w:before="0"/>
         <w:ind w:firstLine="0"/>
+        <w:jc w:val="both"/>
         <w:rPr>
           <w:b/>
         </w:rPr>
@@ -9855,7 +10481,9 @@
     </w:p>
     <w:p>
       <w:pPr>
+        <w:spacing w:line="276" w:lineRule="auto" w:after="120" w:before="0"/>
         <w:ind w:firstLine="0"/>
+        <w:jc w:val="both"/>
         <w:rPr>
           <w:i/>
         </w:rPr>
@@ -10752,6 +11380,7 @@
     </w:tbl>
     <w:p>
       <w:pPr>
+        <w:spacing w:line="276" w:lineRule="auto" w:after="120" w:before="0"/>
         <w:ind w:firstLine="0"/>
         <w:jc w:val="both"/>
         <w:rPr>
@@ -10774,6 +11403,7 @@
     </w:p>
     <w:p>
       <w:pPr>
+        <w:spacing w:line="276" w:lineRule="auto" w:after="120" w:before="0"/>
         <w:ind w:firstLine="708"/>
         <w:jc w:val="both"/>
       </w:pPr>
@@ -10783,6 +11413,7 @@
     </w:p>
     <w:p>
       <w:pPr>
+        <w:spacing w:line="276" w:lineRule="auto" w:after="120" w:before="0"/>
         <w:ind w:firstLine="708"/>
         <w:jc w:val="both"/>
         <w:rPr>
@@ -10798,6 +11429,7 @@
     </w:p>
     <w:p>
       <w:pPr>
+        <w:spacing w:line="276" w:lineRule="auto" w:after="120" w:before="0"/>
         <w:ind w:firstLine="0"/>
         <w:jc w:val="both"/>
         <w:rPr>
@@ -10805,10 +11437,7 @@
         </w:rPr>
       </w:pPr>
       <w:r>
-        <w:rPr>
-          <w:i/>
-        </w:rPr>
-        <w:t>Matriz de riesgos: nivel de riesgo según probabilidad y consecuencia</w:t>
+        <w:t>Evaluación del nivel de riesgo según su probabilidad y consecuencia nivel de riesgo según probabilidad y consecuencia</w:t>
       </w:r>
     </w:p>
     <w:tbl>
@@ -11761,6 +12390,7 @@
     </w:tbl>
     <w:p>
       <w:pPr>
+        <w:spacing w:line="276" w:lineRule="auto" w:after="120" w:before="0"/>
         <w:ind w:firstLine="0"/>
         <w:jc w:val="both"/>
         <w:rPr>
@@ -11783,6 +12413,7 @@
     </w:p>
     <w:p>
       <w:pPr>
+        <w:spacing w:line="276" w:lineRule="auto" w:after="120" w:before="0"/>
         <w:jc w:val="both"/>
         <w:rPr>
           <w:b/>
@@ -11818,6 +12449,7 @@
     </w:p>
     <w:p>
       <w:pPr>
+        <w:spacing w:line="276" w:lineRule="auto" w:after="120" w:before="0"/>
         <w:ind w:firstLine="0"/>
         <w:jc w:val="both"/>
         <w:rPr>
@@ -11833,6 +12465,7 @@
     </w:p>
     <w:p>
       <w:pPr>
+        <w:spacing w:line="276" w:lineRule="auto" w:after="120" w:before="0"/>
         <w:ind w:firstLine="0"/>
         <w:jc w:val="both"/>
         <w:rPr>
@@ -12891,6 +13524,7 @@
     </w:tbl>
     <w:p>
       <w:pPr>
+        <w:spacing w:line="276" w:lineRule="auto" w:after="120" w:before="0"/>
         <w:ind w:firstLine="0"/>
         <w:jc w:val="both"/>
         <w:rPr>
@@ -12926,15 +13560,22 @@
     <w:p>
       <w:pPr>
         <w:pStyle w:val="Ttulo2"/>
+        <w:keepNext/>
+        <w:spacing w:before="240" w:after="80"/>
+        <w:jc w:val="left"/>
         <w:rPr>
           <w:b w:val="0"/>
         </w:rPr>
       </w:pPr>
       <w:r>
-        <w:t>Riesgo seleccionado: pérdida de conexión con la balanza camionera</w:t>
-      </w:r>
-    </w:p>
-    <w:p>
+        <w:t>El riesgo técnico seleccionado corresponde a la pérdida de conexión con la balanza camionera</w:t>
+      </w:r>
+    </w:p>
+    <w:p>
+      <w:pPr>
+        <w:spacing w:line="276" w:lineRule="auto" w:after="120" w:before="0"/>
+        <w:jc w:val="both"/>
+      </w:pPr>
       <w:r>
         <w:t>Se eligió la pérdida de conexión con la balanza camionera porque es el riesgo con mayor probabilidad e impacto combinados. Todo el módulo de pesaje depende de que el socket TCP/IP con la balanza Mettler Toledo IND780 (Mettler-Toledo International Inc., 2022) se mantenga activo; si ese riesgo se materializa, se pierde precisamente la captura automática del peso, que es el objetivo central de todo el proyecto.</w:t>
       </w:r>
@@ -12942,6 +13583,9 @@
     <w:p>
       <w:pPr>
         <w:pStyle w:val="Ttulo2"/>
+        <w:keepNext/>
+        <w:spacing w:before="240" w:after="80"/>
+        <w:jc w:val="left"/>
         <w:rPr>
           <w:b w:val="0"/>
         </w:rPr>
@@ -12951,47 +13595,46 @@
       </w:r>
     </w:p>
     <w:p>
+      <w:pPr>
+        <w:spacing w:line="276" w:lineRule="auto" w:after="120" w:before="0"/>
+        <w:jc w:val="both"/>
+      </w:pPr>
+      <w:r>
+        <w:t>Respecto a la descripción del evento, el backend deja de recibir tramas del Socket Listener conectado a la balanza. El peso deja de capturarse en tiempo real y el indicador de estado cambia a 'Desconectada', tanto en el Dashboard como en la pantalla de Registrar Pesaje.</w:t>
+      </w:r>
+    </w:p>
+    <w:p>
+      <w:pPr>
+        <w:spacing w:line="276" w:lineRule="auto" w:after="120" w:before="0"/>
+        <w:jc w:val="both"/>
+      </w:pPr>
+      <w:r>
+        <w:t>Entre las causas directas identificadas figuran un corte de energía en la caseta de pesaje, un cable de red desconectado o dañado, una falla en el módulo Ethernet de la balanza, o simplemente saturación de la red local.</w:t>
+      </w:r>
+    </w:p>
+    <w:p>
+      <w:pPr>
+        <w:spacing w:line="276" w:lineRule="auto" w:after="120" w:before="0"/>
+        <w:jc w:val="both"/>
+      </w:pPr>
       <w:r>
         <w:rPr>
           <w:b/>
         </w:rPr>
-        <w:t>Descripción del riesgo:</w:t>
-      </w:r>
-      <w:r>
-        <w:t xml:space="preserve"> el backend deja de recibir tramas del Socket Listener conectado a la balanza. El peso deja de capturarse en tiempo real y el indicador de estado cambia a 'Desconectada', tanto en el Dashboard como en la pantalla de Registrar Pesaje.</w:t>
-      </w:r>
-    </w:p>
-    <w:p>
+        <w:t>Acciones de mitigación (antes de que ocurra):</w:t>
+      </w:r>
+      <w:r>
+        <w:t xml:space="preserve"> el UPS SMART3000VS ya contemplado en el estudio de factibilidad protege contra los cortes eléctricos; el backend intenta reconectar el socket automáticamente cuando se cae; y el estado de cada báscula queda siempre visible desde el Dashboard para detectar el problema apenas ocurre.</w:t>
+      </w:r>
+    </w:p>
+    <w:p>
+      <w:pPr>
+        <w:spacing w:line="276" w:lineRule="auto" w:after="120" w:before="0"/>
+        <w:jc w:val="both"/>
+      </w:pPr>
       <w:r>
         <w:rPr>
           <w:b/>
-          <w:noProof/>
-        </w:rPr>
-        <w:lastRenderedPageBreak/>
-        <w:t>Causas posibles:</w:t>
-      </w:r>
-      <w:r>
-        <w:rPr>
-          <w:noProof/>
-        </w:rPr>
-        <w:t xml:space="preserve"> un corte de energía en la caseta de pesaje, un cable de red desconectado o dañado, una falla en el módulo Ethernet de la balanza, o simplemente saturación de la red local.</w:t>
-      </w:r>
-    </w:p>
-    <w:p>
-      <w:r>
-        <w:rPr>
-          <w:b/>
-        </w:rPr>
-        <w:t>Acciones de mitigación (antes de que ocurra):</w:t>
-      </w:r>
-      <w:r>
-        <w:t xml:space="preserve"> el UPS SMART3000VS ya contemplado en el estudio de factibilidad protege contra los cortes eléctricos; el backend intenta reconectar el socket automáticamente cuando se cae; y el estado de cada báscula queda siempre visible desde el Dashboard para detectar el problema apenas ocurre.</w:t>
-      </w:r>
-    </w:p>
-    <w:p>
-      <w:r>
-        <w:rPr>
-          <w:b/>
         </w:rPr>
         <w:t>Plan de contingencia (si el riesgo se materializa):</w:t>
       </w:r>
@@ -13000,32 +13643,41 @@
       </w:r>
     </w:p>
     <w:p>
-      <w:r>
-        <w:rPr>
-          <w:b/>
-        </w:rPr>
-        <w:t>Responsable:</w:t>
-      </w:r>
-      <w:r>
-        <w:t xml:space="preserve"> el administrador del sistema, con apoyo del soporte técnico de red y del proveedor de la balanza cuando el problema lo requiere.</w:t>
-      </w:r>
-    </w:p>
-    <w:p>
-      <w:r>
-        <w:rPr>
-          <w:b/>
-        </w:rPr>
-        <w:t>Disparador (señal de alerta):</w:t>
-      </w:r>
-      <w:r>
-        <w:t xml:space="preserve"> que el estado 'Desconectada' se mantenga por más de dos minutos seguidos en el panel de básculas del Dashboard.</w:t>
-      </w:r>
-    </w:p>
-    <w:p/>
-    <w:p/>
+      <w:pPr>
+        <w:spacing w:line="276" w:lineRule="auto" w:after="120" w:before="0"/>
+        <w:jc w:val="both"/>
+      </w:pPr>
+      <w:r>
+        <w:t>La gestión del control y mitigación está a cargo de el administrador del sistema, con apoyo del soporte técnico de red y del proveedor de la balanza cuando el problema lo requiere.</w:t>
+      </w:r>
+    </w:p>
+    <w:p>
+      <w:pPr>
+        <w:spacing w:line="276" w:lineRule="auto" w:after="120" w:before="0"/>
+        <w:jc w:val="both"/>
+      </w:pPr>
+      <w:r>
+        <w:t>La señal de alerta operativa se activa al detectar que el estado 'Desconectada' se mantenga por más de dos minutos seguidos en el panel de básculas del Dashboard.</w:t>
+      </w:r>
+    </w:p>
+    <w:p>
+      <w:pPr>
+        <w:spacing w:line="276" w:lineRule="auto" w:after="120" w:before="0"/>
+        <w:jc w:val="both"/>
+      </w:pPr>
+    </w:p>
+    <w:p>
+      <w:pPr>
+        <w:spacing w:line="276" w:lineRule="auto" w:after="120" w:before="0"/>
+        <w:jc w:val="both"/>
+      </w:pPr>
+    </w:p>
     <w:p>
       <w:pPr>
         <w:pStyle w:val="Ttulo1"/>
+        <w:keepNext/>
+        <w:spacing w:before="240" w:after="80"/>
+        <w:jc w:val="left"/>
         <w:sectPr>
           <w:pgSz w:w="11912" w:h="16840"/>
           <w:pgMar w:top="1088" w:right="1577" w:bottom="1560" w:left="1100" w:header="720" w:footer="720" w:gutter="0"/>
@@ -13037,6 +13689,9 @@
     <w:p>
       <w:pPr>
         <w:pStyle w:val="Ttulo1"/>
+        <w:keepNext/>
+        <w:spacing w:before="240" w:after="80"/>
+        <w:jc w:val="left"/>
       </w:pPr>
       <w:r>
         <w:lastRenderedPageBreak/>
@@ -13715,6 +14370,8 @@
     </w:tbl>
     <w:p>
       <w:pPr>
+        <w:spacing w:line="276" w:lineRule="auto" w:after="120" w:before="0"/>
+        <w:jc w:val="both"/>
         <w:rPr>
           <w:sz w:val="20"/>
         </w:rPr>
@@ -13733,10 +14390,18 @@
         <w:t xml:space="preserve"> Elaboración propia.</w:t>
       </w:r>
     </w:p>
-    <w:p/>
+    <w:p>
+      <w:pPr>
+        <w:spacing w:line="276" w:lineRule="auto" w:after="120" w:before="0"/>
+        <w:jc w:val="both"/>
+      </w:pPr>
+    </w:p>
     <w:p>
       <w:pPr>
         <w:pStyle w:val="Ttulo1"/>
+        <w:keepNext/>
+        <w:spacing w:before="240" w:after="80"/>
+        <w:jc w:val="left"/>
         <w:sectPr>
           <w:pgSz w:w="11912" w:h="16840"/>
           <w:pgMar w:top="1088" w:right="1577" w:bottom="1560" w:left="1100" w:header="720" w:footer="720" w:gutter="0"/>
@@ -13748,6 +14413,9 @@
     <w:p>
       <w:pPr>
         <w:pStyle w:val="Ttulo1"/>
+        <w:keepNext/>
+        <w:spacing w:before="240" w:after="80"/>
+        <w:jc w:val="left"/>
       </w:pPr>
       <w:r>
         <w:lastRenderedPageBreak/>
@@ -14131,6 +14799,8 @@
     </w:tbl>
     <w:p>
       <w:pPr>
+        <w:spacing w:line="276" w:lineRule="auto" w:after="120" w:before="0"/>
+        <w:jc w:val="both"/>
         <w:rPr>
           <w:sz w:val="20"/>
         </w:rPr>
@@ -14149,10 +14819,18 @@
         <w:t xml:space="preserve"> Elaboración propia a partir del diseño del sistema.</w:t>
       </w:r>
     </w:p>
-    <w:p/>
+    <w:p>
+      <w:pPr>
+        <w:spacing w:line="276" w:lineRule="auto" w:after="120" w:before="0"/>
+        <w:jc w:val="both"/>
+      </w:pPr>
+    </w:p>
     <w:p>
       <w:pPr>
         <w:pStyle w:val="Ttulo1"/>
+        <w:keepNext/>
+        <w:spacing w:before="240" w:after="80"/>
+        <w:jc w:val="left"/>
       </w:pPr>
       <w:r>
         <w:br w:type="page"/>
@@ -14161,6 +14839,9 @@
     <w:p>
       <w:pPr>
         <w:pStyle w:val="Ttulo1"/>
+        <w:keepNext/>
+        <w:spacing w:before="240" w:after="80"/>
+        <w:jc w:val="left"/>
       </w:pPr>
       <w:r>
         <w:lastRenderedPageBreak/>
@@ -14485,6 +15166,8 @@
     </w:tbl>
     <w:p>
       <w:pPr>
+        <w:spacing w:line="276" w:lineRule="auto" w:after="120" w:before="0"/>
+        <w:jc w:val="both"/>
         <w:rPr>
           <w:sz w:val="20"/>
         </w:rPr>
@@ -14503,10 +15186,18 @@
         <w:t xml:space="preserve"> Elaboración propia.</w:t>
       </w:r>
     </w:p>
-    <w:p/>
+    <w:p>
+      <w:pPr>
+        <w:spacing w:line="276" w:lineRule="auto" w:after="120" w:before="0"/>
+        <w:jc w:val="both"/>
+      </w:pPr>
+    </w:p>
     <w:p>
       <w:pPr>
         <w:pStyle w:val="Ttulo1"/>
+        <w:keepNext/>
+        <w:spacing w:before="240" w:after="80"/>
+        <w:jc w:val="left"/>
       </w:pPr>
       <w:r>
         <w:br w:type="page"/>
@@ -14515,6 +15206,9 @@
     <w:p>
       <w:pPr>
         <w:pStyle w:val="Ttulo1"/>
+        <w:keepNext/>
+        <w:spacing w:before="240" w:after="80"/>
+        <w:jc w:val="left"/>
       </w:pPr>
       <w:r>
         <w:lastRenderedPageBreak/>
@@ -14781,6 +15475,8 @@
     </w:tbl>
     <w:p>
       <w:pPr>
+        <w:spacing w:line="276" w:lineRule="auto" w:after="120" w:before="0"/>
+        <w:jc w:val="both"/>
         <w:rPr>
           <w:sz w:val="20"/>
         </w:rPr>
@@ -14799,10 +15495,18 @@
         <w:t xml:space="preserve"> Elaboración propia a partir de los registros de la empresa “El Troje”.</w:t>
       </w:r>
     </w:p>
-    <w:p/>
+    <w:p>
+      <w:pPr>
+        <w:spacing w:line="276" w:lineRule="auto" w:after="120" w:before="0"/>
+        <w:jc w:val="both"/>
+      </w:pPr>
+    </w:p>
     <w:p>
       <w:pPr>
         <w:pStyle w:val="Ttulo1"/>
+        <w:keepNext/>
+        <w:spacing w:before="240" w:after="80"/>
+        <w:jc w:val="left"/>
       </w:pPr>
       <w:r>
         <w:br w:type="page"/>
@@ -14811,6 +15515,9 @@
     <w:p>
       <w:pPr>
         <w:pStyle w:val="Ttulo1"/>
+        <w:keepNext/>
+        <w:spacing w:before="240" w:after="80"/>
+        <w:jc w:val="left"/>
       </w:pPr>
       <w:r>
         <w:lastRenderedPageBreak/>
@@ -15135,6 +15842,8 @@
     </w:tbl>
     <w:p>
       <w:pPr>
+        <w:spacing w:line="276" w:lineRule="auto" w:after="120" w:before="0"/>
+        <w:jc w:val="both"/>
         <w:rPr>
           <w:sz w:val="20"/>
         </w:rPr>
@@ -15153,10 +15862,18 @@
         <w:t xml:space="preserve"> Elaboración propia.</w:t>
       </w:r>
     </w:p>
-    <w:p/>
+    <w:p>
+      <w:pPr>
+        <w:spacing w:line="276" w:lineRule="auto" w:after="120" w:before="0"/>
+        <w:jc w:val="both"/>
+      </w:pPr>
+    </w:p>
     <w:p>
       <w:pPr>
         <w:pStyle w:val="Ttulo1"/>
+        <w:keepNext/>
+        <w:spacing w:before="240" w:after="80"/>
+        <w:jc w:val="left"/>
       </w:pPr>
       <w:r>
         <w:br w:type="page"/>
@@ -15165,6 +15882,9 @@
     <w:p>
       <w:pPr>
         <w:pStyle w:val="Ttulo1"/>
+        <w:keepNext/>
+        <w:spacing w:before="240" w:after="80"/>
+        <w:jc w:val="left"/>
       </w:pPr>
       <w:r>
         <w:lastRenderedPageBreak/>
@@ -15489,6 +16209,8 @@
     </w:tbl>
     <w:p>
       <w:pPr>
+        <w:spacing w:line="276" w:lineRule="auto" w:after="120" w:before="0"/>
+        <w:jc w:val="both"/>
         <w:rPr>
           <w:sz w:val="20"/>
         </w:rPr>
@@ -15507,10 +16229,18 @@
         <w:t xml:space="preserve"> Datos obtenidos de los tableros de Power BI del sistema (período mayo–junio de 2024).</w:t>
       </w:r>
     </w:p>
-    <w:p/>
+    <w:p>
+      <w:pPr>
+        <w:spacing w:line="276" w:lineRule="auto" w:after="120" w:before="0"/>
+        <w:jc w:val="both"/>
+      </w:pPr>
+    </w:p>
     <w:p>
       <w:pPr>
         <w:pStyle w:val="Ttulo1"/>
+        <w:keepNext/>
+        <w:spacing w:before="240" w:after="80"/>
+        <w:jc w:val="left"/>
         <w:sectPr>
           <w:pgSz w:w="11912" w:h="16840"/>
           <w:pgMar w:top="1088" w:right="1577" w:bottom="1560" w:left="1100" w:header="720" w:footer="720" w:gutter="0"/>
@@ -15522,6 +16252,9 @@
     <w:p>
       <w:pPr>
         <w:pStyle w:val="Ttulo1"/>
+        <w:keepNext/>
+        <w:spacing w:before="240" w:after="80"/>
+        <w:jc w:val="left"/>
       </w:pPr>
       <w:r>
         <w:lastRenderedPageBreak/>
@@ -15984,6 +16717,8 @@
     </w:tbl>
     <w:p>
       <w:pPr>
+        <w:spacing w:line="276" w:lineRule="auto" w:after="120" w:before="0"/>
+        <w:jc w:val="both"/>
         <w:rPr>
           <w:sz w:val="20"/>
         </w:rPr>
@@ -16002,10 +16737,18 @@
         <w:t xml:space="preserve"> Elaboración propia.</w:t>
       </w:r>
     </w:p>
-    <w:p/>
+    <w:p>
+      <w:pPr>
+        <w:spacing w:line="276" w:lineRule="auto" w:after="120" w:before="0"/>
+        <w:jc w:val="both"/>
+      </w:pPr>
+    </w:p>
     <w:p>
       <w:pPr>
         <w:pStyle w:val="Ttulo1"/>
+        <w:keepNext/>
+        <w:spacing w:before="240" w:after="80"/>
+        <w:jc w:val="left"/>
       </w:pPr>
       <w:r>
         <w:br w:type="page"/>
@@ -16014,6 +16757,9 @@
     <w:p>
       <w:pPr>
         <w:pStyle w:val="Ttulo1"/>
+        <w:keepNext/>
+        <w:spacing w:before="240" w:after="80"/>
+        <w:jc w:val="left"/>
       </w:pPr>
       <w:r>
         <w:lastRenderedPageBreak/>
@@ -16462,6 +17208,8 @@
     </w:tbl>
     <w:p>
       <w:pPr>
+        <w:spacing w:line="276" w:lineRule="auto" w:after="120" w:before="0"/>
+        <w:jc w:val="both"/>
         <w:rPr>
           <w:sz w:val="20"/>
         </w:rPr>
@@ -16480,10 +17228,18 @@
         <w:t xml:space="preserve"> Elaboración propia.</w:t>
       </w:r>
     </w:p>
-    <w:p/>
+    <w:p>
+      <w:pPr>
+        <w:spacing w:line="276" w:lineRule="auto" w:after="120" w:before="0"/>
+        <w:jc w:val="both"/>
+      </w:pPr>
+    </w:p>
     <w:p>
       <w:pPr>
         <w:pStyle w:val="Ttulo1"/>
+        <w:keepNext/>
+        <w:spacing w:before="240" w:after="80"/>
+        <w:jc w:val="left"/>
         <w:sectPr>
           <w:pgSz w:w="11912" w:h="16840"/>
           <w:pgMar w:top="1088" w:right="1577" w:bottom="1560" w:left="1100" w:header="720" w:footer="720" w:gutter="0"/>
@@ -16495,6 +17251,9 @@
     <w:p>
       <w:pPr>
         <w:pStyle w:val="Ttulo1"/>
+        <w:keepNext/>
+        <w:spacing w:before="240" w:after="80"/>
+        <w:jc w:val="left"/>
       </w:pPr>
       <w:r>
         <w:lastRenderedPageBreak/>
@@ -16934,6 +17693,8 @@
     </w:tbl>
     <w:p>
       <w:pPr>
+        <w:spacing w:line="276" w:lineRule="auto" w:after="120" w:before="0"/>
+        <w:jc w:val="both"/>
         <w:rPr>
           <w:sz w:val="20"/>
         </w:rPr>
@@ -16952,10 +17713,18 @@
         <w:t xml:space="preserve"> Elaboración propia.</w:t>
       </w:r>
     </w:p>
-    <w:p/>
+    <w:p>
+      <w:pPr>
+        <w:spacing w:line="276" w:lineRule="auto" w:after="120" w:before="0"/>
+        <w:jc w:val="both"/>
+      </w:pPr>
+    </w:p>
     <w:p>
       <w:pPr>
         <w:pStyle w:val="Ttulo1"/>
+        <w:keepNext/>
+        <w:spacing w:before="240" w:after="80"/>
+        <w:jc w:val="left"/>
       </w:pPr>
       <w:r>
         <w:br w:type="page"/>
@@ -16964,6 +17733,9 @@
     <w:p>
       <w:pPr>
         <w:pStyle w:val="Ttulo1"/>
+        <w:keepNext/>
+        <w:spacing w:before="240" w:after="80"/>
+        <w:jc w:val="left"/>
       </w:pPr>
       <w:r>
         <w:lastRenderedPageBreak/>
@@ -17321,6 +18093,8 @@
     </w:tbl>
     <w:p>
       <w:pPr>
+        <w:spacing w:line="276" w:lineRule="auto" w:after="120" w:before="0"/>
+        <w:jc w:val="both"/>
         <w:rPr>
           <w:sz w:val="20"/>
         </w:rPr>
@@ -17339,10 +18113,18 @@
         <w:t xml:space="preserve"> Elaboración propia a partir del levantamiento en la empresa “El Troje”.</w:t>
       </w:r>
     </w:p>
-    <w:p/>
+    <w:p>
+      <w:pPr>
+        <w:spacing w:line="276" w:lineRule="auto" w:after="120" w:before="0"/>
+        <w:jc w:val="both"/>
+      </w:pPr>
+    </w:p>
     <w:p>
       <w:pPr>
         <w:pStyle w:val="Ttulo1"/>
+        <w:keepNext/>
+        <w:spacing w:before="240" w:after="80"/>
+        <w:jc w:val="left"/>
       </w:pPr>
       <w:r>
         <w:br w:type="page"/>
@@ -17351,6 +18133,9 @@
     <w:p>
       <w:pPr>
         <w:pStyle w:val="Ttulo1"/>
+        <w:keepNext/>
+        <w:spacing w:before="240" w:after="80"/>
+        <w:jc w:val="left"/>
       </w:pPr>
       <w:r>
         <w:lastRenderedPageBreak/>
@@ -17793,6 +18578,8 @@
     </w:tbl>
     <w:p>
       <w:pPr>
+        <w:spacing w:line="276" w:lineRule="auto" w:after="120" w:before="0"/>
+        <w:jc w:val="both"/>
         <w:rPr>
           <w:sz w:val="20"/>
         </w:rPr>
@@ -17811,10 +18598,18 @@
         <w:t xml:space="preserve"> Elaboración propia.</w:t>
       </w:r>
     </w:p>
-    <w:p/>
+    <w:p>
+      <w:pPr>
+        <w:spacing w:line="276" w:lineRule="auto" w:after="120" w:before="0"/>
+        <w:jc w:val="both"/>
+      </w:pPr>
+    </w:p>
     <w:p>
       <w:pPr>
         <w:pStyle w:val="Ttulo1"/>
+        <w:keepNext/>
+        <w:spacing w:before="240" w:after="80"/>
+        <w:jc w:val="left"/>
       </w:pPr>
       <w:r>
         <w:br w:type="page"/>
@@ -17822,9 +18617,9 @@
     </w:p>
     <w:p>
       <w:pPr>
-        <w:spacing w:after="0"/>
+        <w:spacing w:after="120" w:line="276" w:lineRule="auto" w:before="0"/>
         <w:ind w:left="708" w:hanging="2"/>
-        <w:jc w:val="center"/>
+        <w:jc w:val="both"/>
         <w:rPr>
           <w:sz w:val="2"/>
         </w:rPr>
@@ -17833,6 +18628,9 @@
     <w:p>
       <w:pPr>
         <w:pStyle w:val="Ttulo1"/>
+        <w:keepNext/>
+        <w:spacing w:before="240" w:after="80"/>
+        <w:jc w:val="left"/>
       </w:pPr>
       <w:r>
         <w:t xml:space="preserve">Anexo W. </w:t>
@@ -17851,6 +18649,10 @@
       </w:r>
     </w:p>
     <w:p>
+      <w:pPr>
+        <w:spacing w:line="276" w:lineRule="auto" w:after="120" w:before="0"/>
+        <w:jc w:val="both"/>
+      </w:pPr>
       <w:r>
         <w:t xml:space="preserve">En este anexo se presentan los diagramas de los casos de uso dinámicos elaborados para el módulo de pesaje: </w:t>
       </w:r>
@@ -17880,6 +18682,10 @@
       </w:r>
     </w:p>
     <w:p>
+      <w:pPr>
+        <w:spacing w:line="276" w:lineRule="auto" w:after="120" w:before="0"/>
+        <w:jc w:val="both"/>
+      </w:pPr>
       <w:r>
         <w:t xml:space="preserve">La </w:t>
       </w:r>
@@ -17898,6 +18704,8 @@
     </w:p>
     <w:p>
       <w:pPr>
+        <w:spacing w:line="276" w:lineRule="auto" w:after="120" w:before="0"/>
+        <w:jc w:val="both"/>
         <w:rPr>
           <w:b/>
         </w:rPr>
@@ -17911,6 +18719,8 @@
     </w:p>
     <w:p>
       <w:pPr>
+        <w:spacing w:line="276" w:lineRule="auto" w:after="120" w:before="0"/>
+        <w:jc w:val="both"/>
         <w:rPr>
           <w:i/>
         </w:rPr>
@@ -17923,6 +18733,10 @@
       </w:r>
     </w:p>
     <w:p>
+      <w:pPr>
+        <w:spacing w:line="276" w:lineRule="auto" w:after="120" w:before="0"/>
+        <w:jc w:val="both"/>
+      </w:pPr>
       <w:r>
         <w:rPr>
           <w:noProof/>
@@ -17979,6 +18793,10 @@
       </w:r>
     </w:p>
     <w:p>
+      <w:pPr>
+        <w:spacing w:line="276" w:lineRule="auto" w:after="120" w:before="0"/>
+        <w:jc w:val="both"/>
+      </w:pPr>
       <w:r>
         <w:rPr>
           <w:i/>
@@ -17996,6 +18814,10 @@
       </w:r>
     </w:p>
     <w:p>
+      <w:pPr>
+        <w:spacing w:line="276" w:lineRule="auto" w:after="120" w:before="0"/>
+        <w:jc w:val="both"/>
+      </w:pPr>
       <w:r>
         <w:t xml:space="preserve">La </w:t>
       </w:r>
@@ -18008,7 +18830,9 @@
     </w:p>
     <w:p>
       <w:pPr>
+        <w:spacing w:line="276" w:lineRule="auto" w:after="120" w:before="0"/>
         <w:ind w:left="708" w:hanging="2"/>
+        <w:jc w:val="both"/>
         <w:rPr>
           <w:b/>
         </w:rPr>
@@ -18022,6 +18846,8 @@
     </w:p>
     <w:p>
       <w:pPr>
+        <w:spacing w:line="276" w:lineRule="auto" w:after="120" w:before="0"/>
+        <w:jc w:val="both"/>
         <w:rPr>
           <w:i/>
         </w:rPr>
@@ -18034,6 +18860,10 @@
       </w:r>
     </w:p>
     <w:p>
+      <w:pPr>
+        <w:spacing w:line="276" w:lineRule="auto" w:after="120" w:before="0"/>
+        <w:jc w:val="both"/>
+      </w:pPr>
       <w:r>
         <w:rPr>
           <w:noProof/>
@@ -18090,6 +18920,10 @@
       </w:r>
     </w:p>
     <w:p>
+      <w:pPr>
+        <w:spacing w:line="276" w:lineRule="auto" w:after="120" w:before="0"/>
+        <w:jc w:val="both"/>
+      </w:pPr>
       <w:r>
         <w:rPr>
           <w:i/>
@@ -18101,6 +18935,10 @@
       </w:r>
     </w:p>
     <w:p>
+      <w:pPr>
+        <w:spacing w:line="276" w:lineRule="auto" w:after="120" w:before="0"/>
+        <w:jc w:val="both"/>
+      </w:pPr>
       <w:r>
         <w:t xml:space="preserve">La </w:t>
       </w:r>
@@ -18113,6 +18951,8 @@
     </w:p>
     <w:p>
       <w:pPr>
+        <w:spacing w:line="276" w:lineRule="auto" w:after="120" w:before="0"/>
+        <w:jc w:val="both"/>
         <w:rPr>
           <w:b/>
         </w:rPr>
@@ -18126,6 +18966,8 @@
     </w:p>
     <w:p>
       <w:pPr>
+        <w:spacing w:line="276" w:lineRule="auto" w:after="120" w:before="0"/>
+        <w:jc w:val="both"/>
         <w:rPr>
           <w:i/>
         </w:rPr>
@@ -18138,6 +18980,10 @@
       </w:r>
     </w:p>
     <w:p>
+      <w:pPr>
+        <w:spacing w:line="276" w:lineRule="auto" w:after="120" w:before="0"/>
+        <w:jc w:val="both"/>
+      </w:pPr>
       <w:r>
         <w:rPr>
           <w:noProof/>
@@ -18194,6 +19040,10 @@
       </w:r>
     </w:p>
     <w:p>
+      <w:pPr>
+        <w:spacing w:line="276" w:lineRule="auto" w:after="120" w:before="0"/>
+        <w:jc w:val="both"/>
+      </w:pPr>
       <w:r>
         <w:rPr>
           <w:i/>
@@ -18205,6 +19055,10 @@
       </w:r>
     </w:p>
     <w:p>
+      <w:pPr>
+        <w:spacing w:line="276" w:lineRule="auto" w:after="120" w:before="0"/>
+        <w:jc w:val="both"/>
+      </w:pPr>
       <w:r>
         <w:t xml:space="preserve">La </w:t>
       </w:r>
@@ -18223,6 +19077,8 @@
     </w:p>
     <w:p>
       <w:pPr>
+        <w:spacing w:line="276" w:lineRule="auto" w:after="120" w:before="0"/>
+        <w:jc w:val="both"/>
         <w:rPr>
           <w:b/>
         </w:rPr>
@@ -18236,6 +19092,8 @@
     </w:p>
     <w:p>
       <w:pPr>
+        <w:spacing w:line="276" w:lineRule="auto" w:after="120" w:before="0"/>
+        <w:jc w:val="both"/>
         <w:rPr>
           <w:i/>
         </w:rPr>
@@ -18248,6 +19106,10 @@
       </w:r>
     </w:p>
     <w:p>
+      <w:pPr>
+        <w:spacing w:line="276" w:lineRule="auto" w:after="120" w:before="0"/>
+        <w:jc w:val="both"/>
+      </w:pPr>
       <w:r>
         <w:rPr>
           <w:noProof/>
@@ -18304,6 +19166,10 @@
       </w:r>
     </w:p>
     <w:p>
+      <w:pPr>
+        <w:spacing w:line="276" w:lineRule="auto" w:after="120" w:before="0"/>
+        <w:jc w:val="both"/>
+      </w:pPr>
       <w:r>
         <w:rPr>
           <w:i/>
@@ -18317,6 +19183,9 @@
     <w:p>
       <w:pPr>
         <w:pStyle w:val="Ttulo1"/>
+        <w:keepNext/>
+        <w:spacing w:before="240" w:after="80"/>
+        <w:jc w:val="left"/>
       </w:pPr>
     </w:p>
     <w:sectPr>

</xml_diff>